<commit_message>
TKB: basic 1.2.3, description 3.0.6 och fyra äldre huvudversioner
- clinicalprocess.healthcond.basic ombyggd från taggen 1.2.3 (GetObservations 1.2)
  i stället för otaggad trunk (2.0-snapshot).
- clinicalprocess.healthcond.description uppdaterad 3.0.5 -> 3.0.6.
- Nya IG:er för äldre huvudversioner: description 2.1.19, actoutcome 3.1.10,
  logistics 2.0.7 och activityprescription.actoutcome 1.0.2.
- QUESTIONS.md och registret uppdaterade.

Co-Authored-By: Claude Opus 5.5 (1M context) <noreply@anthropic.com>
Claude-Session: https://claude.ai/code/session_01PWNjpg5dPEDcJYMsaDmTUW
</commit_message>
<xml_diff>
--- a/igs/TKB_clinicalprocess_healthcond_description/input/images/AB_clinicalprocess_healthcond_description.docx
+++ b/igs/TKB_clinicalprocess_healthcond_description/input/images/AB_clinicalprocess_healthcond_description.docx
@@ -1,6 +1,6 @@
 
 <file path=word/document.xml><?xml version="1.0" encoding="utf-8"?>
-<w:document xmlns:wpc="http://schemas.microsoft.com/office/word/2010/wordprocessingCanvas" xmlns:cx="http://schemas.microsoft.com/office/drawing/2014/chartex" xmlns:cx1="http://schemas.microsoft.com/office/drawing/2015/9/8/chartex" xmlns:cx2="http://schemas.microsoft.com/office/drawing/2015/10/21/chartex" xmlns:cx3="http://schemas.microsoft.com/office/drawing/2016/5/9/chartex" xmlns:cx4="http://schemas.microsoft.com/office/drawing/2016/5/10/chartex" xmlns:cx5="http://schemas.microsoft.com/office/drawing/2016/5/11/chartex" xmlns:cx6="http://schemas.microsoft.com/office/drawing/2016/5/12/chartex" xmlns:cx7="http://schemas.microsoft.com/office/drawing/2016/5/13/chartex" xmlns:cx8="http://schemas.microsoft.com/office/drawing/2016/5/14/chartex" xmlns:mc="http://schemas.openxmlformats.org/markup-compatibility/2006" xmlns:aink="http://schemas.microsoft.com/office/drawing/2016/ink" xmlns:am3d="http://schemas.microsoft.com/office/drawing/2017/model3d" xmlns:o="urn:schemas-microsoft-com:office:office" xmlns:oel="http://schemas.microsoft.com/office/2019/extlst" xmlns:r="http://schemas.openxmlformats.org/officeDocument/2006/relationships" xmlns:m="http://schemas.openxmlformats.org/officeDocument/2006/math" xmlns:v="urn:schemas-microsoft-com:vml" xmlns:wp14="http://schemas.microsoft.com/office/word/2010/wordprocessingDrawing" xmlns:wp="http://schemas.openxmlformats.org/drawingml/2006/wordprocessingDrawing" xmlns:w10="urn:schemas-microsoft-com:office:word" xmlns:w="http://schemas.openxmlformats.org/wordprocessingml/2006/main" xmlns:w14="http://schemas.microsoft.com/office/word/2010/wordml" xmlns:w15="http://schemas.microsoft.com/office/word/2012/wordml" xmlns:w16cex="http://schemas.microsoft.com/office/word/2018/wordml/cex" xmlns:w16cid="http://schemas.microsoft.com/office/word/2016/wordml/cid" xmlns:w16="http://schemas.microsoft.com/office/word/2018/wordml" xmlns:w16du="http://schemas.microsoft.com/office/word/2023/wordml/word16du" xmlns:w16sdtdh="http://schemas.microsoft.com/office/word/2020/wordml/sdtdatahash" xmlns:w16se="http://schemas.microsoft.com/office/word/2015/wordml/symex" xmlns:wpg="http://schemas.microsoft.com/office/word/2010/wordprocessingGroup" xmlns:wpi="http://schemas.microsoft.com/office/word/2010/wordprocessingInk" xmlns:wne="http://schemas.microsoft.com/office/word/2006/wordml" xmlns:wps="http://schemas.microsoft.com/office/word/2010/wordprocessingShape" mc:Ignorable="w14 w15 w16se w16cid w16 w16cex w16sdtdh w16du wp14">
+<w:document xmlns:wpc="http://schemas.microsoft.com/office/word/2010/wordprocessingCanvas" xmlns:cx="http://schemas.microsoft.com/office/drawing/2014/chartex" xmlns:cx1="http://schemas.microsoft.com/office/drawing/2015/9/8/chartex" xmlns:cx2="http://schemas.microsoft.com/office/drawing/2015/10/21/chartex" xmlns:cx3="http://schemas.microsoft.com/office/drawing/2016/5/9/chartex" xmlns:cx4="http://schemas.microsoft.com/office/drawing/2016/5/10/chartex" xmlns:cx5="http://schemas.microsoft.com/office/drawing/2016/5/11/chartex" xmlns:cx6="http://schemas.microsoft.com/office/drawing/2016/5/12/chartex" xmlns:cx7="http://schemas.microsoft.com/office/drawing/2016/5/13/chartex" xmlns:cx8="http://schemas.microsoft.com/office/drawing/2016/5/14/chartex" xmlns:mc="http://schemas.openxmlformats.org/markup-compatibility/2006" xmlns:aink="http://schemas.microsoft.com/office/drawing/2016/ink" xmlns:am3d="http://schemas.microsoft.com/office/drawing/2017/model3d" xmlns:o="urn:schemas-microsoft-com:office:office" xmlns:oel="http://schemas.microsoft.com/office/2019/extlst" xmlns:r="http://schemas.openxmlformats.org/officeDocument/2006/relationships" xmlns:m="http://schemas.openxmlformats.org/officeDocument/2006/math" xmlns:v="urn:schemas-microsoft-com:vml" xmlns:wp14="http://schemas.microsoft.com/office/word/2010/wordprocessingDrawing" xmlns:wp="http://schemas.openxmlformats.org/drawingml/2006/wordprocessingDrawing" xmlns:w10="urn:schemas-microsoft-com:office:word" xmlns:w="http://schemas.openxmlformats.org/wordprocessingml/2006/main" xmlns:w14="http://schemas.microsoft.com/office/word/2010/wordml" xmlns:w15="http://schemas.microsoft.com/office/word/2012/wordml" xmlns:w16cex="http://schemas.microsoft.com/office/word/2018/wordml/cex" xmlns:w16cid="http://schemas.microsoft.com/office/word/2016/wordml/cid" xmlns:w16="http://schemas.microsoft.com/office/word/2018/wordml" xmlns:w16du="http://schemas.microsoft.com/office/word/2023/wordml/word16du" xmlns:w16sdtdh="http://schemas.microsoft.com/office/word/2020/wordml/sdtdatahash" xmlns:w16sdtfl="http://schemas.microsoft.com/office/word/2024/wordml/sdtformatlock" xmlns:w16se="http://schemas.microsoft.com/office/word/2015/wordml/symex" xmlns:wpg="http://schemas.microsoft.com/office/word/2010/wordprocessingGroup" xmlns:wpi="http://schemas.microsoft.com/office/word/2010/wordprocessingInk" xmlns:wne="http://schemas.microsoft.com/office/word/2006/wordml" xmlns:wps="http://schemas.microsoft.com/office/word/2010/wordprocessingShape" mc:Ignorable="w14 w15 w16se w16cid w16 w16cex w16sdtdh w16sdtfl w16du wp14">
   <w:body>
     <w:sdt>
       <w:sdtPr>
@@ -45,14 +45,22 @@
               <w:dataBinding w:prefixMappings="xmlns:ns0='http://purl.org/dc/elements/1.1/' xmlns:ns1='http://schemas.openxmlformats.org/package/2006/metadata/core-properties' " w:xpath="/ns1:coreProperties[1]/ns0:title[1]" w:storeItemID="{6C3C8BC8-F283-45AE-878A-BAB7291924A1}"/>
               <w:text w:multiLine="1"/>
             </w:sdtPr>
-            <w:sdtEndPr/>
             <w:sdtContent>
+              <w:proofErr w:type="spellStart"/>
               <w:r>
                 <w:rPr>
                   <w:color w:val="E7DAC5" w:themeColor="accent2"/>
                   <w:sz w:val="84"/>
                 </w:rPr>
-                <w:t>clinicalprocess_</w:t>
+                <w:t>clinicalprocess</w:t>
+              </w:r>
+              <w:proofErr w:type="spellEnd"/>
+              <w:r>
+                <w:rPr>
+                  <w:color w:val="E7DAC5" w:themeColor="accent2"/>
+                  <w:sz w:val="84"/>
+                </w:rPr>
+                <w:t>_</w:t>
               </w:r>
               <w:r>
                 <w:rPr>
@@ -61,12 +69,21 @@
                 </w:rPr>
                 <w:br/>
               </w:r>
+              <w:proofErr w:type="spellStart"/>
               <w:r>
                 <w:rPr>
                   <w:color w:val="E7DAC5" w:themeColor="accent2"/>
                   <w:sz w:val="84"/>
                 </w:rPr>
-                <w:t>healthcond_</w:t>
+                <w:t>healthcond</w:t>
+              </w:r>
+              <w:proofErr w:type="spellEnd"/>
+              <w:r>
+                <w:rPr>
+                  <w:color w:val="E7DAC5" w:themeColor="accent2"/>
+                  <w:sz w:val="84"/>
+                </w:rPr>
+                <w:t>_</w:t>
               </w:r>
               <w:r>
                 <w:rPr>
@@ -75,6 +92,7 @@
                 </w:rPr>
                 <w:br/>
               </w:r>
+              <w:proofErr w:type="spellStart"/>
               <w:r>
                 <w:rPr>
                   <w:color w:val="E7DAC5" w:themeColor="accent2"/>
@@ -82,6 +100,7 @@
                 </w:rPr>
                 <w:t>description</w:t>
               </w:r>
+              <w:proofErr w:type="spellEnd"/>
             </w:sdtContent>
           </w:sdt>
         </w:p>
@@ -91,7 +110,6 @@
               <w:color w:val="FFFFFF" w:themeColor="background1"/>
               <w:sz w:val="42"/>
               <w:szCs w:val="42"/>
-              <w:lang w:val="da-DK"/>
             </w:rPr>
             <w:id w:val="1869794757"/>
             <w:placeholder>
@@ -100,7 +118,6 @@
             <w:dataBinding w:prefixMappings="xmlns:ns0='http://purl.org/dc/elements/1.1/' xmlns:ns1='http://schemas.openxmlformats.org/package/2006/metadata/core-properties' " w:xpath="/ns1:coreProperties[1]/ns0:subject[1]" w:storeItemID="{6C3C8BC8-F283-45AE-878A-BAB7291924A1}"/>
             <w:text w:multiLine="1"/>
           </w:sdtPr>
-          <w:sdtEndPr/>
           <w:sdtContent>
             <w:p>
               <w:pPr>
@@ -116,7 +133,6 @@
                   <w:color w:val="FFFFFF" w:themeColor="background1"/>
                   <w:sz w:val="42"/>
                   <w:szCs w:val="42"/>
-                  <w:lang w:val="da-DK"/>
                 </w:rPr>
                 <w:t xml:space="preserve">Arkitekturella beslut </w:t>
               </w:r>
@@ -125,7 +141,6 @@
                   <w:color w:val="FFFFFF" w:themeColor="background1"/>
                   <w:sz w:val="42"/>
                   <w:szCs w:val="42"/>
-                  <w:lang w:val="da-DK"/>
                 </w:rPr>
                 <w:br/>
                 <w:t>Version 3.0</w:t>
@@ -135,7 +150,6 @@
                   <w:color w:val="FFFFFF" w:themeColor="background1"/>
                   <w:sz w:val="42"/>
                   <w:szCs w:val="42"/>
-                  <w:lang w:val="da-DK"/>
                 </w:rPr>
                 <w:t>.</w:t>
               </w:r>
@@ -144,16 +158,14 @@
                   <w:color w:val="FFFFFF" w:themeColor="background1"/>
                   <w:sz w:val="42"/>
                   <w:szCs w:val="42"/>
-                  <w:lang w:val="da-DK"/>
                 </w:rPr>
-                <w:t>4</w:t>
+                <w:t>6</w:t>
               </w:r>
               <w:r>
                 <w:rPr>
                   <w:color w:val="FFFFFF" w:themeColor="background1"/>
                   <w:sz w:val="42"/>
                   <w:szCs w:val="42"/>
-                  <w:lang w:val="da-DK"/>
                 </w:rPr>
                 <w:br/>
                 <w:t>20</w:t>
@@ -163,16 +175,22 @@
                   <w:color w:val="FFFFFF" w:themeColor="background1"/>
                   <w:sz w:val="42"/>
                   <w:szCs w:val="42"/>
-                  <w:lang w:val="da-DK"/>
                 </w:rPr>
-                <w:t>24</w:t>
+                <w:t>2</w:t>
               </w:r>
               <w:r>
                 <w:rPr>
                   <w:color w:val="FFFFFF" w:themeColor="background1"/>
                   <w:sz w:val="42"/>
                   <w:szCs w:val="42"/>
-                  <w:lang w:val="da-DK"/>
+                </w:rPr>
+                <w:t>6</w:t>
+              </w:r>
+              <w:r>
+                <w:rPr>
+                  <w:color w:val="FFFFFF" w:themeColor="background1"/>
+                  <w:sz w:val="42"/>
+                  <w:szCs w:val="42"/>
                 </w:rPr>
                 <w:t>-</w:t>
               </w:r>
@@ -181,7 +199,6 @@
                   <w:color w:val="FFFFFF" w:themeColor="background1"/>
                   <w:sz w:val="42"/>
                   <w:szCs w:val="42"/>
-                  <w:lang w:val="da-DK"/>
                 </w:rPr>
                 <w:t>0</w:t>
               </w:r>
@@ -190,16 +207,14 @@
                   <w:color w:val="FFFFFF" w:themeColor="background1"/>
                   <w:sz w:val="42"/>
                   <w:szCs w:val="42"/>
-                  <w:lang w:val="da-DK"/>
                 </w:rPr>
-                <w:t>5</w:t>
+                <w:t>6</w:t>
               </w:r>
               <w:r>
                 <w:rPr>
                   <w:color w:val="FFFFFF" w:themeColor="background1"/>
                   <w:sz w:val="42"/>
                   <w:szCs w:val="42"/>
-                  <w:lang w:val="da-DK"/>
                 </w:rPr>
                 <w:t>-</w:t>
               </w:r>
@@ -208,9 +223,8 @@
                   <w:color w:val="FFFFFF" w:themeColor="background1"/>
                   <w:sz w:val="42"/>
                   <w:szCs w:val="42"/>
-                  <w:lang w:val="da-DK"/>
                 </w:rPr>
-                <w:t>28</w:t>
+                <w:t>03</w:t>
               </w:r>
             </w:p>
           </w:sdtContent>
@@ -1174,7 +1188,21 @@
               <w:rPr>
                 <w:rFonts w:cstheme="minorHAnsi"/>
               </w:rPr>
-              <w:t xml:space="preserve">Johan Eltes, </w:t>
+              <w:t xml:space="preserve">Johan </w:t>
+            </w:r>
+            <w:proofErr w:type="spellStart"/>
+            <w:r>
+              <w:rPr>
+                <w:rFonts w:cstheme="minorHAnsi"/>
+              </w:rPr>
+              <w:t>Eltes</w:t>
+            </w:r>
+            <w:proofErr w:type="spellEnd"/>
+            <w:r>
+              <w:rPr>
+                <w:rFonts w:cstheme="minorHAnsi"/>
+              </w:rPr>
+              <w:t xml:space="preserve">, </w:t>
             </w:r>
             <w:r>
               <w:rPr>
@@ -1182,11 +1210,19 @@
               </w:rPr>
               <w:br/>
             </w:r>
-            <w:r>
-              <w:rPr>
-                <w:rFonts w:cstheme="minorHAnsi"/>
-              </w:rPr>
-              <w:t>Cynergia AB</w:t>
+            <w:proofErr w:type="spellStart"/>
+            <w:r>
+              <w:rPr>
+                <w:rFonts w:cstheme="minorHAnsi"/>
+              </w:rPr>
+              <w:t>Cynergia</w:t>
+            </w:r>
+            <w:proofErr w:type="spellEnd"/>
+            <w:r>
+              <w:rPr>
+                <w:rFonts w:cstheme="minorHAnsi"/>
+              </w:rPr>
+              <w:t xml:space="preserve"> AB</w:t>
             </w:r>
           </w:p>
         </w:tc>
@@ -1283,8 +1319,16 @@
               <w:rPr>
                 <w:rFonts w:cstheme="minorHAnsi"/>
               </w:rPr>
-              <w:t>Björn Genfors, Mawell</w:t>
-            </w:r>
+              <w:t xml:space="preserve">Björn Genfors, </w:t>
+            </w:r>
+            <w:proofErr w:type="spellStart"/>
+            <w:r>
+              <w:rPr>
+                <w:rFonts w:cstheme="minorHAnsi"/>
+              </w:rPr>
+              <w:t>Mawell</w:t>
+            </w:r>
+            <w:proofErr w:type="spellEnd"/>
           </w:p>
         </w:tc>
         <w:tc>
@@ -1596,7 +1640,21 @@
               <w:rPr>
                 <w:rFonts w:cstheme="minorHAnsi"/>
               </w:rPr>
-              <w:t>Förtydligat skrivning av beslut 1 (avsaknad av Informationsspecifikation), lagt till beslutspunkt 2 (kompabilitet till äldre minorversion).</w:t>
+              <w:t xml:space="preserve">Förtydligat skrivning av beslut 1 (avsaknad av Informationsspecifikation), lagt till beslutspunkt 2 (kompabilitet till äldre </w:t>
+            </w:r>
+            <w:proofErr w:type="spellStart"/>
+            <w:r>
+              <w:rPr>
+                <w:rFonts w:cstheme="minorHAnsi"/>
+              </w:rPr>
+              <w:t>minorversion</w:t>
+            </w:r>
+            <w:proofErr w:type="spellEnd"/>
+            <w:r>
+              <w:rPr>
+                <w:rFonts w:cstheme="minorHAnsi"/>
+              </w:rPr>
+              <w:t>).</w:t>
             </w:r>
           </w:p>
         </w:tc>
@@ -2317,7 +2375,25 @@
                 <w:lang w:val="sv-SE"/>
               </w:rPr>
               <w:lastRenderedPageBreak/>
-              <w:t>Tagit bort AB om kompabilitetsbrott för GetCareDocumentation 2 då det inte längre gäller nu när kontraktet är i version 3.</w:t>
+              <w:t xml:space="preserve">Tagit bort AB om kompabilitetsbrott för </w:t>
+            </w:r>
+            <w:proofErr w:type="spellStart"/>
+            <w:r>
+              <w:rPr>
+                <w:rFonts w:asciiTheme="minorHAnsi" w:hAnsiTheme="minorHAnsi" w:cstheme="minorHAnsi"/>
+                <w:sz w:val="20"/>
+                <w:lang w:val="sv-SE"/>
+              </w:rPr>
+              <w:t>GetCareDocumentation</w:t>
+            </w:r>
+            <w:proofErr w:type="spellEnd"/>
+            <w:r>
+              <w:rPr>
+                <w:rFonts w:asciiTheme="minorHAnsi" w:hAnsiTheme="minorHAnsi" w:cstheme="minorHAnsi"/>
+                <w:sz w:val="20"/>
+                <w:lang w:val="sv-SE"/>
+              </w:rPr>
+              <w:t xml:space="preserve"> 2 då det inte längre gäller nu när kontraktet är i version 3.</w:t>
             </w:r>
           </w:p>
           <w:p>
@@ -2774,6 +2850,152 @@
                 <w:rFonts w:cstheme="minorHAnsi"/>
               </w:rPr>
               <w:t>Thomas Siltberg</w:t>
+            </w:r>
+          </w:p>
+        </w:tc>
+        <w:tc>
+          <w:tcPr>
+            <w:tcW w:w="4100" w:type="dxa"/>
+            <w:tcBorders>
+              <w:top w:val="single" w:sz="4" w:space="0" w:color="A33662" w:themeColor="accent1"/>
+              <w:left w:val="single" w:sz="24" w:space="0" w:color="FFFFFF" w:themeColor="background1"/>
+              <w:bottom w:val="single" w:sz="4" w:space="0" w:color="A33662" w:themeColor="accent1"/>
+            </w:tcBorders>
+          </w:tcPr>
+          <w:p>
+            <w:pPr>
+              <w:pStyle w:val="TableText"/>
+              <w:ind w:right="0"/>
+              <w:rPr>
+                <w:rFonts w:asciiTheme="minorHAnsi" w:hAnsiTheme="minorHAnsi" w:cstheme="minorHAnsi"/>
+                <w:sz w:val="20"/>
+                <w:lang w:val="sv-SE"/>
+              </w:rPr>
+            </w:pPr>
+            <w:r>
+              <w:rPr>
+                <w:rFonts w:asciiTheme="minorHAnsi" w:hAnsiTheme="minorHAnsi" w:cstheme="minorHAnsi"/>
+                <w:sz w:val="20"/>
+                <w:lang w:val="sv-SE"/>
+              </w:rPr>
+              <w:t>Stegrad domänversion. Inga ändringar i detta dokument</w:t>
+            </w:r>
+            <w:r>
+              <w:rPr>
+                <w:rFonts w:asciiTheme="minorHAnsi" w:hAnsiTheme="minorHAnsi" w:cstheme="minorHAnsi"/>
+                <w:sz w:val="20"/>
+                <w:lang w:val="sv-SE"/>
+              </w:rPr>
+              <w:t>.</w:t>
+            </w:r>
+          </w:p>
+        </w:tc>
+      </w:tr>
+      <w:tr>
+        <w:tc>
+          <w:tcPr>
+            <w:tcW w:w="1418" w:type="dxa"/>
+            <w:tcBorders>
+              <w:top w:val="single" w:sz="4" w:space="0" w:color="A33662" w:themeColor="accent1"/>
+              <w:bottom w:val="single" w:sz="4" w:space="0" w:color="A33662" w:themeColor="accent1"/>
+              <w:right w:val="single" w:sz="24" w:space="0" w:color="FFFFFF" w:themeColor="background1"/>
+            </w:tcBorders>
+          </w:tcPr>
+          <w:p>
+            <w:pPr>
+              <w:rPr>
+                <w:rFonts w:cstheme="minorHAnsi"/>
+              </w:rPr>
+            </w:pPr>
+            <w:r>
+              <w:rPr>
+                <w:rFonts w:cstheme="minorHAnsi"/>
+              </w:rPr>
+              <w:t>3.0.</w:t>
+            </w:r>
+            <w:r>
+              <w:rPr>
+                <w:rFonts w:cstheme="minorHAnsi"/>
+              </w:rPr>
+              <w:t>6</w:t>
+            </w:r>
+          </w:p>
+        </w:tc>
+        <w:tc>
+          <w:tcPr>
+            <w:tcW w:w="1276" w:type="dxa"/>
+            <w:tcBorders>
+              <w:top w:val="single" w:sz="4" w:space="0" w:color="A33662" w:themeColor="accent1"/>
+              <w:left w:val="single" w:sz="24" w:space="0" w:color="FFFFFF" w:themeColor="background1"/>
+              <w:bottom w:val="single" w:sz="4" w:space="0" w:color="A33662" w:themeColor="accent1"/>
+              <w:right w:val="single" w:sz="24" w:space="0" w:color="FFFFFF" w:themeColor="background1"/>
+            </w:tcBorders>
+          </w:tcPr>
+          <w:p>
+            <w:pPr>
+              <w:rPr>
+                <w:rFonts w:cstheme="minorHAnsi"/>
+              </w:rPr>
+            </w:pPr>
+            <w:r>
+              <w:rPr>
+                <w:rFonts w:cstheme="minorHAnsi"/>
+              </w:rPr>
+              <w:t>202</w:t>
+            </w:r>
+            <w:r>
+              <w:rPr>
+                <w:rFonts w:cstheme="minorHAnsi"/>
+              </w:rPr>
+              <w:t>6</w:t>
+            </w:r>
+            <w:r>
+              <w:rPr>
+                <w:rFonts w:cstheme="minorHAnsi"/>
+              </w:rPr>
+              <w:t>-0</w:t>
+            </w:r>
+            <w:r>
+              <w:rPr>
+                <w:rFonts w:cstheme="minorHAnsi"/>
+              </w:rPr>
+              <w:t>6</w:t>
+            </w:r>
+            <w:r>
+              <w:rPr>
+                <w:rFonts w:cstheme="minorHAnsi"/>
+              </w:rPr>
+              <w:t>-0</w:t>
+            </w:r>
+            <w:r>
+              <w:rPr>
+                <w:rFonts w:cstheme="minorHAnsi"/>
+              </w:rPr>
+              <w:t>3</w:t>
+            </w:r>
+          </w:p>
+        </w:tc>
+        <w:tc>
+          <w:tcPr>
+            <w:tcW w:w="2268" w:type="dxa"/>
+            <w:tcBorders>
+              <w:top w:val="single" w:sz="4" w:space="0" w:color="A33662" w:themeColor="accent1"/>
+              <w:left w:val="single" w:sz="24" w:space="0" w:color="FFFFFF" w:themeColor="background1"/>
+              <w:bottom w:val="single" w:sz="4" w:space="0" w:color="A33662" w:themeColor="accent1"/>
+              <w:right w:val="single" w:sz="24" w:space="0" w:color="FFFFFF" w:themeColor="background1"/>
+            </w:tcBorders>
+          </w:tcPr>
+          <w:p>
+            <w:pPr>
+              <w:rPr>
+                <w:rFonts w:cstheme="minorHAnsi"/>
+              </w:rPr>
+            </w:pPr>
+            <w:r>
+              <w:rPr>
+                <w:rFonts w:cstheme="minorHAnsi"/>
+              </w:rPr>
+              <w:t>Tobias Blomberg</w:t>
             </w:r>
           </w:p>
         </w:tc>
@@ -3032,7 +3254,15 @@
           </w:tcPr>
           <w:p>
             <w:r>
-              <w:t>Socialstyrelsens informationsspecifkation för uppmärksamhetsinformation</w:t>
+              <w:t xml:space="preserve">Socialstyrelsens </w:t>
+            </w:r>
+            <w:proofErr w:type="spellStart"/>
+            <w:r>
+              <w:t>informationsspecifkation</w:t>
+            </w:r>
+            <w:proofErr w:type="spellEnd"/>
+            <w:r>
+              <w:t xml:space="preserve"> för uppmärksamhetsinformation</w:t>
             </w:r>
           </w:p>
         </w:tc>
@@ -3093,7 +3323,15 @@
     </w:p>
     <w:p>
       <w:r>
-        <w:t>Detta dokument beskriver de viktiga arkitekturella beslut (AB) som fattats under projektet. Ett arkitekturellt beslut kan innefatta alla aspekter av arkitekturen såsom systemstruktur, funktionalitet, standarduppfyllnad samt operationella aspekter.</w:t>
+        <w:t xml:space="preserve">Detta dokument beskriver de viktiga arkitekturella beslut (AB) som fattats under projektet. Ett </w:t>
+      </w:r>
+      <w:proofErr w:type="spellStart"/>
+      <w:r>
+        <w:t>arkitekturellt</w:t>
+      </w:r>
+      <w:proofErr w:type="spellEnd"/>
+      <w:r>
+        <w:t xml:space="preserve"> beslut kan innefatta alla aspekter av arkitekturen såsom systemstruktur, funktionalitet, standarduppfyllnad samt operationella aspekter.</w:t>
       </w:r>
     </w:p>
     <w:p>
@@ -3478,11 +3716,16 @@
       </w:r>
       <w:bookmarkEnd w:id="18"/>
       <w:bookmarkEnd w:id="19"/>
+      <w:proofErr w:type="spellStart"/>
       <w:r>
         <w:t>Info</w:t>
       </w:r>
       <w:r>
-        <w:t>rmationsspecifkation har inte tagits fram</w:t>
+        <w:t>rmationsspecifkation</w:t>
+      </w:r>
+      <w:proofErr w:type="spellEnd"/>
+      <w:r>
+        <w:t xml:space="preserve"> har inte tagits fram</w:t>
       </w:r>
       <w:bookmarkStart w:id="21" w:name="_Toc185913456"/>
       <w:bookmarkEnd w:id="20"/>
@@ -4133,7 +4376,23 @@
                 <w:rFonts w:asciiTheme="minorHAnsi" w:hAnsiTheme="minorHAnsi" w:cstheme="minorHAnsi"/>
                 <w:lang w:val="sv-SE"/>
               </w:rPr>
-              <w:t>kation finns nu för kontraktet GetCareDocumentation i och med uppdatering till majorversion 3.</w:t>
+              <w:t xml:space="preserve">kation finns nu för kontraktet </w:t>
+            </w:r>
+            <w:proofErr w:type="spellStart"/>
+            <w:r>
+              <w:rPr>
+                <w:rFonts w:asciiTheme="minorHAnsi" w:hAnsiTheme="minorHAnsi" w:cstheme="minorHAnsi"/>
+                <w:lang w:val="sv-SE"/>
+              </w:rPr>
+              <w:t>GetCareDocumentation</w:t>
+            </w:r>
+            <w:proofErr w:type="spellEnd"/>
+            <w:r>
+              <w:rPr>
+                <w:rFonts w:asciiTheme="minorHAnsi" w:hAnsiTheme="minorHAnsi" w:cstheme="minorHAnsi"/>
+                <w:lang w:val="sv-SE"/>
+              </w:rPr>
+              <w:t xml:space="preserve"> i och med uppdatering till majorversion 3.</w:t>
             </w:r>
           </w:p>
         </w:tc>
@@ -4326,10 +4585,24 @@
         <w:rPr>
           <w:strike/>
         </w:rPr>
-        <w:t>Kompabilitetsbrott, avsaknad av kompabilitet till äldre minorversion.</w:t>
+        <w:t xml:space="preserve">Kompabilitetsbrott, avsaknad av kompabilitet till äldre </w:t>
       </w:r>
+      <w:proofErr w:type="spellStart"/>
+      <w:r>
+        <w:rPr>
+          <w:strike/>
+        </w:rPr>
+        <w:t>minorversion</w:t>
+      </w:r>
+      <w:proofErr w:type="spellEnd"/>
+      <w:r>
+        <w:rPr>
+          <w:strike/>
+        </w:rPr>
+        <w:t>.</w:t>
+      </w:r>
+      <w:bookmarkEnd w:id="22"/>
       <w:bookmarkEnd w:id="23"/>
-      <w:bookmarkEnd w:id="22"/>
       <w:r>
         <w:rPr>
           <w:strike/>
@@ -4928,7 +5201,25 @@
                 <w:strike/>
                 <w:lang w:val="sv-SE"/>
               </w:rPr>
-              <w:t xml:space="preserve">Versionen 2.1 av tjänstekontraktet GetCareDocumentation innehåller förändringar som gör tjänstekontraktet kompabilitetsbrytande i relation till version 2.0. Se kompabilitetsmall i tjänstekontraktsbeskrivningen, kap 2.1.3, Förändrade tjänstekontrakt. Bakgrunden till detta är att tidigare var detta ett tillåtet förvarande men som nu inte medges. </w:t>
+              <w:t xml:space="preserve">Versionen 2.1 av tjänstekontraktet </w:t>
+            </w:r>
+            <w:proofErr w:type="spellStart"/>
+            <w:r>
+              <w:rPr>
+                <w:rFonts w:asciiTheme="minorHAnsi" w:hAnsiTheme="minorHAnsi" w:cstheme="minorHAnsi"/>
+                <w:strike/>
+                <w:lang w:val="sv-SE"/>
+              </w:rPr>
+              <w:t>GetCareDocumentation</w:t>
+            </w:r>
+            <w:proofErr w:type="spellEnd"/>
+            <w:r>
+              <w:rPr>
+                <w:rFonts w:asciiTheme="minorHAnsi" w:hAnsiTheme="minorHAnsi" w:cstheme="minorHAnsi"/>
+                <w:strike/>
+                <w:lang w:val="sv-SE"/>
+              </w:rPr>
+              <w:t xml:space="preserve"> innehåller förändringar som gör tjänstekontraktet kompabilitetsbrytande i relation till version 2.0. Se kompabilitetsmall i tjänstekontraktsbeskrivningen, kap 2.1.3, Förändrade tjänstekontrakt. Bakgrunden till detta är att tidigare var detta ett tillåtet förvarande men som nu inte medges. </w:t>
             </w:r>
           </w:p>
           <w:p>
@@ -5132,12 +5423,8 @@
     </w:tbl>
     <w:p/>
     <w:sectPr>
-      <w:headerReference w:type="even" r:id="rId15"/>
-      <w:headerReference w:type="default" r:id="rId16"/>
-      <w:footerReference w:type="even" r:id="rId17"/>
-      <w:footerReference w:type="default" r:id="rId18"/>
-      <w:headerReference w:type="first" r:id="rId19"/>
-      <w:footerReference w:type="first" r:id="rId20"/>
+      <w:headerReference w:type="default" r:id="rId15"/>
+      <w:footerReference w:type="default" r:id="rId16"/>
       <w:type w:val="continuous"/>
       <w:pgSz w:w="11906" w:h="16838"/>
       <w:pgMar w:top="2069" w:right="1418" w:bottom="1418" w:left="1418" w:header="709" w:footer="709" w:gutter="0"/>
@@ -5151,7 +5438,7 @@
 </file>
 
 <file path=word/endnotes.xml><?xml version="1.0" encoding="utf-8"?>
-<w:endnotes xmlns:wpc="http://schemas.microsoft.com/office/word/2010/wordprocessingCanvas" xmlns:cx="http://schemas.microsoft.com/office/drawing/2014/chartex" xmlns:cx1="http://schemas.microsoft.com/office/drawing/2015/9/8/chartex" xmlns:cx2="http://schemas.microsoft.com/office/drawing/2015/10/21/chartex" xmlns:cx3="http://schemas.microsoft.com/office/drawing/2016/5/9/chartex" xmlns:cx4="http://schemas.microsoft.com/office/drawing/2016/5/10/chartex" xmlns:cx5="http://schemas.microsoft.com/office/drawing/2016/5/11/chartex" xmlns:cx6="http://schemas.microsoft.com/office/drawing/2016/5/12/chartex" xmlns:cx7="http://schemas.microsoft.com/office/drawing/2016/5/13/chartex" xmlns:cx8="http://schemas.microsoft.com/office/drawing/2016/5/14/chartex" xmlns:mc="http://schemas.openxmlformats.org/markup-compatibility/2006" xmlns:aink="http://schemas.microsoft.com/office/drawing/2016/ink" xmlns:am3d="http://schemas.microsoft.com/office/drawing/2017/model3d" xmlns:o="urn:schemas-microsoft-com:office:office" xmlns:oel="http://schemas.microsoft.com/office/2019/extlst" xmlns:r="http://schemas.openxmlformats.org/officeDocument/2006/relationships" xmlns:m="http://schemas.openxmlformats.org/officeDocument/2006/math" xmlns:v="urn:schemas-microsoft-com:vml" xmlns:wp14="http://schemas.microsoft.com/office/word/2010/wordprocessingDrawing" xmlns:wp="http://schemas.openxmlformats.org/drawingml/2006/wordprocessingDrawing" xmlns:w10="urn:schemas-microsoft-com:office:word" xmlns:w="http://schemas.openxmlformats.org/wordprocessingml/2006/main" xmlns:w14="http://schemas.microsoft.com/office/word/2010/wordml" xmlns:w15="http://schemas.microsoft.com/office/word/2012/wordml" xmlns:w16cex="http://schemas.microsoft.com/office/word/2018/wordml/cex" xmlns:w16cid="http://schemas.microsoft.com/office/word/2016/wordml/cid" xmlns:w16="http://schemas.microsoft.com/office/word/2018/wordml" xmlns:w16du="http://schemas.microsoft.com/office/word/2023/wordml/word16du" xmlns:w16sdtdh="http://schemas.microsoft.com/office/word/2020/wordml/sdtdatahash" xmlns:w16se="http://schemas.microsoft.com/office/word/2015/wordml/symex" xmlns:wpg="http://schemas.microsoft.com/office/word/2010/wordprocessingGroup" xmlns:wpi="http://schemas.microsoft.com/office/word/2010/wordprocessingInk" xmlns:wne="http://schemas.microsoft.com/office/word/2006/wordml" xmlns:wps="http://schemas.microsoft.com/office/word/2010/wordprocessingShape" mc:Ignorable="w14 w15 w16se w16cid w16 w16cex w16sdtdh w16du wp14">
+<w:endnotes xmlns:wpc="http://schemas.microsoft.com/office/word/2010/wordprocessingCanvas" xmlns:cx="http://schemas.microsoft.com/office/drawing/2014/chartex" xmlns:cx1="http://schemas.microsoft.com/office/drawing/2015/9/8/chartex" xmlns:cx2="http://schemas.microsoft.com/office/drawing/2015/10/21/chartex" xmlns:cx3="http://schemas.microsoft.com/office/drawing/2016/5/9/chartex" xmlns:cx4="http://schemas.microsoft.com/office/drawing/2016/5/10/chartex" xmlns:cx5="http://schemas.microsoft.com/office/drawing/2016/5/11/chartex" xmlns:cx6="http://schemas.microsoft.com/office/drawing/2016/5/12/chartex" xmlns:cx7="http://schemas.microsoft.com/office/drawing/2016/5/13/chartex" xmlns:cx8="http://schemas.microsoft.com/office/drawing/2016/5/14/chartex" xmlns:mc="http://schemas.openxmlformats.org/markup-compatibility/2006" xmlns:aink="http://schemas.microsoft.com/office/drawing/2016/ink" xmlns:am3d="http://schemas.microsoft.com/office/drawing/2017/model3d" xmlns:o="urn:schemas-microsoft-com:office:office" xmlns:oel="http://schemas.microsoft.com/office/2019/extlst" xmlns:r="http://schemas.openxmlformats.org/officeDocument/2006/relationships" xmlns:m="http://schemas.openxmlformats.org/officeDocument/2006/math" xmlns:v="urn:schemas-microsoft-com:vml" xmlns:wp14="http://schemas.microsoft.com/office/word/2010/wordprocessingDrawing" xmlns:wp="http://schemas.openxmlformats.org/drawingml/2006/wordprocessingDrawing" xmlns:w10="urn:schemas-microsoft-com:office:word" xmlns:w="http://schemas.openxmlformats.org/wordprocessingml/2006/main" xmlns:w14="http://schemas.microsoft.com/office/word/2010/wordml" xmlns:w15="http://schemas.microsoft.com/office/word/2012/wordml" xmlns:w16cex="http://schemas.microsoft.com/office/word/2018/wordml/cex" xmlns:w16cid="http://schemas.microsoft.com/office/word/2016/wordml/cid" xmlns:w16="http://schemas.microsoft.com/office/word/2018/wordml" xmlns:w16du="http://schemas.microsoft.com/office/word/2023/wordml/word16du" xmlns:w16sdtdh="http://schemas.microsoft.com/office/word/2020/wordml/sdtdatahash" xmlns:w16sdtfl="http://schemas.microsoft.com/office/word/2024/wordml/sdtformatlock" xmlns:w16se="http://schemas.microsoft.com/office/word/2015/wordml/symex" xmlns:wpg="http://schemas.microsoft.com/office/word/2010/wordprocessingGroup" xmlns:wpi="http://schemas.microsoft.com/office/word/2010/wordprocessingInk" xmlns:wne="http://schemas.microsoft.com/office/word/2006/wordml" xmlns:wps="http://schemas.microsoft.com/office/word/2010/wordprocessingShape" mc:Ignorable="w14 w15 w16se w16cid w16 w16cex w16sdtdh w16sdtfl w16du wp14">
   <w:endnote w:type="separator" w:id="-1">
     <w:p>
       <w:r>
@@ -5177,17 +5464,7 @@
 </file>
 
 <file path=word/footer1.xml><?xml version="1.0" encoding="utf-8"?>
-<w:ftr xmlns:wpc="http://schemas.microsoft.com/office/word/2010/wordprocessingCanvas" xmlns:cx="http://schemas.microsoft.com/office/drawing/2014/chartex" xmlns:cx1="http://schemas.microsoft.com/office/drawing/2015/9/8/chartex" xmlns:cx2="http://schemas.microsoft.com/office/drawing/2015/10/21/chartex" xmlns:cx3="http://schemas.microsoft.com/office/drawing/2016/5/9/chartex" xmlns:cx4="http://schemas.microsoft.com/office/drawing/2016/5/10/chartex" xmlns:cx5="http://schemas.microsoft.com/office/drawing/2016/5/11/chartex" xmlns:cx6="http://schemas.microsoft.com/office/drawing/2016/5/12/chartex" xmlns:cx7="http://schemas.microsoft.com/office/drawing/2016/5/13/chartex" xmlns:cx8="http://schemas.microsoft.com/office/drawing/2016/5/14/chartex" xmlns:mc="http://schemas.openxmlformats.org/markup-compatibility/2006" xmlns:aink="http://schemas.microsoft.com/office/drawing/2016/ink" xmlns:am3d="http://schemas.microsoft.com/office/drawing/2017/model3d" xmlns:o="urn:schemas-microsoft-com:office:office" xmlns:oel="http://schemas.microsoft.com/office/2019/extlst" xmlns:r="http://schemas.openxmlformats.org/officeDocument/2006/relationships" xmlns:m="http://schemas.openxmlformats.org/officeDocument/2006/math" xmlns:v="urn:schemas-microsoft-com:vml" xmlns:wp14="http://schemas.microsoft.com/office/word/2010/wordprocessingDrawing" xmlns:wp="http://schemas.openxmlformats.org/drawingml/2006/wordprocessingDrawing" xmlns:w10="urn:schemas-microsoft-com:office:word" xmlns:w="http://schemas.openxmlformats.org/wordprocessingml/2006/main" xmlns:w14="http://schemas.microsoft.com/office/word/2010/wordml" xmlns:w15="http://schemas.microsoft.com/office/word/2012/wordml" xmlns:w16cex="http://schemas.microsoft.com/office/word/2018/wordml/cex" xmlns:w16cid="http://schemas.microsoft.com/office/word/2016/wordml/cid" xmlns:w16="http://schemas.microsoft.com/office/word/2018/wordml" xmlns:w16du="http://schemas.microsoft.com/office/word/2023/wordml/word16du" xmlns:w16sdtdh="http://schemas.microsoft.com/office/word/2020/wordml/sdtdatahash" xmlns:w16se="http://schemas.microsoft.com/office/word/2015/wordml/symex" xmlns:wpg="http://schemas.microsoft.com/office/word/2010/wordprocessingGroup" xmlns:wpi="http://schemas.microsoft.com/office/word/2010/wordprocessingInk" xmlns:wne="http://schemas.microsoft.com/office/word/2006/wordml" xmlns:wps="http://schemas.microsoft.com/office/word/2010/wordprocessingShape" mc:Ignorable="w14 w15 w16se w16cid w16 w16cex w16sdtdh w16du wp14">
-  <w:p>
-    <w:pPr>
-      <w:pStyle w:val="Sidfot"/>
-    </w:pPr>
-  </w:p>
-</w:ftr>
-</file>
-
-<file path=word/footer2.xml><?xml version="1.0" encoding="utf-8"?>
-<w:ftr xmlns:wpc="http://schemas.microsoft.com/office/word/2010/wordprocessingCanvas" xmlns:cx="http://schemas.microsoft.com/office/drawing/2014/chartex" xmlns:cx1="http://schemas.microsoft.com/office/drawing/2015/9/8/chartex" xmlns:cx2="http://schemas.microsoft.com/office/drawing/2015/10/21/chartex" xmlns:cx3="http://schemas.microsoft.com/office/drawing/2016/5/9/chartex" xmlns:cx4="http://schemas.microsoft.com/office/drawing/2016/5/10/chartex" xmlns:cx5="http://schemas.microsoft.com/office/drawing/2016/5/11/chartex" xmlns:cx6="http://schemas.microsoft.com/office/drawing/2016/5/12/chartex" xmlns:cx7="http://schemas.microsoft.com/office/drawing/2016/5/13/chartex" xmlns:cx8="http://schemas.microsoft.com/office/drawing/2016/5/14/chartex" xmlns:mc="http://schemas.openxmlformats.org/markup-compatibility/2006" xmlns:aink="http://schemas.microsoft.com/office/drawing/2016/ink" xmlns:am3d="http://schemas.microsoft.com/office/drawing/2017/model3d" xmlns:o="urn:schemas-microsoft-com:office:office" xmlns:oel="http://schemas.microsoft.com/office/2019/extlst" xmlns:r="http://schemas.openxmlformats.org/officeDocument/2006/relationships" xmlns:m="http://schemas.openxmlformats.org/officeDocument/2006/math" xmlns:v="urn:schemas-microsoft-com:vml" xmlns:wp14="http://schemas.microsoft.com/office/word/2010/wordprocessingDrawing" xmlns:wp="http://schemas.openxmlformats.org/drawingml/2006/wordprocessingDrawing" xmlns:w10="urn:schemas-microsoft-com:office:word" xmlns:w="http://schemas.openxmlformats.org/wordprocessingml/2006/main" xmlns:w14="http://schemas.microsoft.com/office/word/2010/wordml" xmlns:w15="http://schemas.microsoft.com/office/word/2012/wordml" xmlns:w16cex="http://schemas.microsoft.com/office/word/2018/wordml/cex" xmlns:w16cid="http://schemas.microsoft.com/office/word/2016/wordml/cid" xmlns:w16="http://schemas.microsoft.com/office/word/2018/wordml" xmlns:w16du="http://schemas.microsoft.com/office/word/2023/wordml/word16du" xmlns:w16sdtdh="http://schemas.microsoft.com/office/word/2020/wordml/sdtdatahash" xmlns:w16se="http://schemas.microsoft.com/office/word/2015/wordml/symex" xmlns:wpg="http://schemas.microsoft.com/office/word/2010/wordprocessingGroup" xmlns:wpi="http://schemas.microsoft.com/office/word/2010/wordprocessingInk" xmlns:wne="http://schemas.microsoft.com/office/word/2006/wordml" xmlns:wps="http://schemas.microsoft.com/office/word/2010/wordprocessingShape" mc:Ignorable="w14 w15 w16se w16cid w16 w16cex w16sdtdh w16du wp14">
+<w:ftr xmlns:wpc="http://schemas.microsoft.com/office/word/2010/wordprocessingCanvas" xmlns:cx="http://schemas.microsoft.com/office/drawing/2014/chartex" xmlns:cx1="http://schemas.microsoft.com/office/drawing/2015/9/8/chartex" xmlns:cx2="http://schemas.microsoft.com/office/drawing/2015/10/21/chartex" xmlns:cx3="http://schemas.microsoft.com/office/drawing/2016/5/9/chartex" xmlns:cx4="http://schemas.microsoft.com/office/drawing/2016/5/10/chartex" xmlns:cx5="http://schemas.microsoft.com/office/drawing/2016/5/11/chartex" xmlns:cx6="http://schemas.microsoft.com/office/drawing/2016/5/12/chartex" xmlns:cx7="http://schemas.microsoft.com/office/drawing/2016/5/13/chartex" xmlns:cx8="http://schemas.microsoft.com/office/drawing/2016/5/14/chartex" xmlns:mc="http://schemas.openxmlformats.org/markup-compatibility/2006" xmlns:aink="http://schemas.microsoft.com/office/drawing/2016/ink" xmlns:am3d="http://schemas.microsoft.com/office/drawing/2017/model3d" xmlns:o="urn:schemas-microsoft-com:office:office" xmlns:oel="http://schemas.microsoft.com/office/2019/extlst" xmlns:r="http://schemas.openxmlformats.org/officeDocument/2006/relationships" xmlns:m="http://schemas.openxmlformats.org/officeDocument/2006/math" xmlns:v="urn:schemas-microsoft-com:vml" xmlns:wp14="http://schemas.microsoft.com/office/word/2010/wordprocessingDrawing" xmlns:wp="http://schemas.openxmlformats.org/drawingml/2006/wordprocessingDrawing" xmlns:w10="urn:schemas-microsoft-com:office:word" xmlns:w="http://schemas.openxmlformats.org/wordprocessingml/2006/main" xmlns:w14="http://schemas.microsoft.com/office/word/2010/wordml" xmlns:w15="http://schemas.microsoft.com/office/word/2012/wordml" xmlns:w16cex="http://schemas.microsoft.com/office/word/2018/wordml/cex" xmlns:w16cid="http://schemas.microsoft.com/office/word/2016/wordml/cid" xmlns:w16="http://schemas.microsoft.com/office/word/2018/wordml" xmlns:w16du="http://schemas.microsoft.com/office/word/2023/wordml/word16du" xmlns:w16sdtdh="http://schemas.microsoft.com/office/word/2020/wordml/sdtdatahash" xmlns:w16sdtfl="http://schemas.microsoft.com/office/word/2024/wordml/sdtformatlock" xmlns:w16se="http://schemas.microsoft.com/office/word/2015/wordml/symex" xmlns:wpg="http://schemas.microsoft.com/office/word/2010/wordprocessingGroup" xmlns:wpi="http://schemas.microsoft.com/office/word/2010/wordprocessingInk" xmlns:wne="http://schemas.microsoft.com/office/word/2006/wordml" xmlns:wps="http://schemas.microsoft.com/office/word/2010/wordprocessingShape" mc:Ignorable="w14 w15 w16se w16cid w16 w16cex w16sdtdh w16sdtfl w16du wp14">
   <w:tbl>
     <w:tblPr>
       <w:tblStyle w:val="Tabellrutnt"/>
@@ -5375,18 +5652,8 @@
 </w:ftr>
 </file>
 
-<file path=word/footer3.xml><?xml version="1.0" encoding="utf-8"?>
-<w:ftr xmlns:wpc="http://schemas.microsoft.com/office/word/2010/wordprocessingCanvas" xmlns:cx="http://schemas.microsoft.com/office/drawing/2014/chartex" xmlns:cx1="http://schemas.microsoft.com/office/drawing/2015/9/8/chartex" xmlns:cx2="http://schemas.microsoft.com/office/drawing/2015/10/21/chartex" xmlns:cx3="http://schemas.microsoft.com/office/drawing/2016/5/9/chartex" xmlns:cx4="http://schemas.microsoft.com/office/drawing/2016/5/10/chartex" xmlns:cx5="http://schemas.microsoft.com/office/drawing/2016/5/11/chartex" xmlns:cx6="http://schemas.microsoft.com/office/drawing/2016/5/12/chartex" xmlns:cx7="http://schemas.microsoft.com/office/drawing/2016/5/13/chartex" xmlns:cx8="http://schemas.microsoft.com/office/drawing/2016/5/14/chartex" xmlns:mc="http://schemas.openxmlformats.org/markup-compatibility/2006" xmlns:aink="http://schemas.microsoft.com/office/drawing/2016/ink" xmlns:am3d="http://schemas.microsoft.com/office/drawing/2017/model3d" xmlns:o="urn:schemas-microsoft-com:office:office" xmlns:oel="http://schemas.microsoft.com/office/2019/extlst" xmlns:r="http://schemas.openxmlformats.org/officeDocument/2006/relationships" xmlns:m="http://schemas.openxmlformats.org/officeDocument/2006/math" xmlns:v="urn:schemas-microsoft-com:vml" xmlns:wp14="http://schemas.microsoft.com/office/word/2010/wordprocessingDrawing" xmlns:wp="http://schemas.openxmlformats.org/drawingml/2006/wordprocessingDrawing" xmlns:w10="urn:schemas-microsoft-com:office:word" xmlns:w="http://schemas.openxmlformats.org/wordprocessingml/2006/main" xmlns:w14="http://schemas.microsoft.com/office/word/2010/wordml" xmlns:w15="http://schemas.microsoft.com/office/word/2012/wordml" xmlns:w16cex="http://schemas.microsoft.com/office/word/2018/wordml/cex" xmlns:w16cid="http://schemas.microsoft.com/office/word/2016/wordml/cid" xmlns:w16="http://schemas.microsoft.com/office/word/2018/wordml" xmlns:w16du="http://schemas.microsoft.com/office/word/2023/wordml/word16du" xmlns:w16sdtdh="http://schemas.microsoft.com/office/word/2020/wordml/sdtdatahash" xmlns:w16se="http://schemas.microsoft.com/office/word/2015/wordml/symex" xmlns:wpg="http://schemas.microsoft.com/office/word/2010/wordprocessingGroup" xmlns:wpi="http://schemas.microsoft.com/office/word/2010/wordprocessingInk" xmlns:wne="http://schemas.microsoft.com/office/word/2006/wordml" xmlns:wps="http://schemas.microsoft.com/office/word/2010/wordprocessingShape" mc:Ignorable="w14 w15 w16se w16cid w16 w16cex w16sdtdh w16du wp14">
-  <w:p>
-    <w:pPr>
-      <w:pStyle w:val="Sidfot"/>
-    </w:pPr>
-  </w:p>
-</w:ftr>
-</file>
-
 <file path=word/footnotes.xml><?xml version="1.0" encoding="utf-8"?>
-<w:footnotes xmlns:wpc="http://schemas.microsoft.com/office/word/2010/wordprocessingCanvas" xmlns:cx="http://schemas.microsoft.com/office/drawing/2014/chartex" xmlns:cx1="http://schemas.microsoft.com/office/drawing/2015/9/8/chartex" xmlns:cx2="http://schemas.microsoft.com/office/drawing/2015/10/21/chartex" xmlns:cx3="http://schemas.microsoft.com/office/drawing/2016/5/9/chartex" xmlns:cx4="http://schemas.microsoft.com/office/drawing/2016/5/10/chartex" xmlns:cx5="http://schemas.microsoft.com/office/drawing/2016/5/11/chartex" xmlns:cx6="http://schemas.microsoft.com/office/drawing/2016/5/12/chartex" xmlns:cx7="http://schemas.microsoft.com/office/drawing/2016/5/13/chartex" xmlns:cx8="http://schemas.microsoft.com/office/drawing/2016/5/14/chartex" xmlns:mc="http://schemas.openxmlformats.org/markup-compatibility/2006" xmlns:aink="http://schemas.microsoft.com/office/drawing/2016/ink" xmlns:am3d="http://schemas.microsoft.com/office/drawing/2017/model3d" xmlns:o="urn:schemas-microsoft-com:office:office" xmlns:oel="http://schemas.microsoft.com/office/2019/extlst" xmlns:r="http://schemas.openxmlformats.org/officeDocument/2006/relationships" xmlns:m="http://schemas.openxmlformats.org/officeDocument/2006/math" xmlns:v="urn:schemas-microsoft-com:vml" xmlns:wp14="http://schemas.microsoft.com/office/word/2010/wordprocessingDrawing" xmlns:wp="http://schemas.openxmlformats.org/drawingml/2006/wordprocessingDrawing" xmlns:w10="urn:schemas-microsoft-com:office:word" xmlns:w="http://schemas.openxmlformats.org/wordprocessingml/2006/main" xmlns:w14="http://schemas.microsoft.com/office/word/2010/wordml" xmlns:w15="http://schemas.microsoft.com/office/word/2012/wordml" xmlns:w16cex="http://schemas.microsoft.com/office/word/2018/wordml/cex" xmlns:w16cid="http://schemas.microsoft.com/office/word/2016/wordml/cid" xmlns:w16="http://schemas.microsoft.com/office/word/2018/wordml" xmlns:w16du="http://schemas.microsoft.com/office/word/2023/wordml/word16du" xmlns:w16sdtdh="http://schemas.microsoft.com/office/word/2020/wordml/sdtdatahash" xmlns:w16se="http://schemas.microsoft.com/office/word/2015/wordml/symex" xmlns:wpg="http://schemas.microsoft.com/office/word/2010/wordprocessingGroup" xmlns:wpi="http://schemas.microsoft.com/office/word/2010/wordprocessingInk" xmlns:wne="http://schemas.microsoft.com/office/word/2006/wordml" xmlns:wps="http://schemas.microsoft.com/office/word/2010/wordprocessingShape" mc:Ignorable="w14 w15 w16se w16cid w16 w16cex w16sdtdh w16du wp14">
+<w:footnotes xmlns:wpc="http://schemas.microsoft.com/office/word/2010/wordprocessingCanvas" xmlns:cx="http://schemas.microsoft.com/office/drawing/2014/chartex" xmlns:cx1="http://schemas.microsoft.com/office/drawing/2015/9/8/chartex" xmlns:cx2="http://schemas.microsoft.com/office/drawing/2015/10/21/chartex" xmlns:cx3="http://schemas.microsoft.com/office/drawing/2016/5/9/chartex" xmlns:cx4="http://schemas.microsoft.com/office/drawing/2016/5/10/chartex" xmlns:cx5="http://schemas.microsoft.com/office/drawing/2016/5/11/chartex" xmlns:cx6="http://schemas.microsoft.com/office/drawing/2016/5/12/chartex" xmlns:cx7="http://schemas.microsoft.com/office/drawing/2016/5/13/chartex" xmlns:cx8="http://schemas.microsoft.com/office/drawing/2016/5/14/chartex" xmlns:mc="http://schemas.openxmlformats.org/markup-compatibility/2006" xmlns:aink="http://schemas.microsoft.com/office/drawing/2016/ink" xmlns:am3d="http://schemas.microsoft.com/office/drawing/2017/model3d" xmlns:o="urn:schemas-microsoft-com:office:office" xmlns:oel="http://schemas.microsoft.com/office/2019/extlst" xmlns:r="http://schemas.openxmlformats.org/officeDocument/2006/relationships" xmlns:m="http://schemas.openxmlformats.org/officeDocument/2006/math" xmlns:v="urn:schemas-microsoft-com:vml" xmlns:wp14="http://schemas.microsoft.com/office/word/2010/wordprocessingDrawing" xmlns:wp="http://schemas.openxmlformats.org/drawingml/2006/wordprocessingDrawing" xmlns:w10="urn:schemas-microsoft-com:office:word" xmlns:w="http://schemas.openxmlformats.org/wordprocessingml/2006/main" xmlns:w14="http://schemas.microsoft.com/office/word/2010/wordml" xmlns:w15="http://schemas.microsoft.com/office/word/2012/wordml" xmlns:w16cex="http://schemas.microsoft.com/office/word/2018/wordml/cex" xmlns:w16cid="http://schemas.microsoft.com/office/word/2016/wordml/cid" xmlns:w16="http://schemas.microsoft.com/office/word/2018/wordml" xmlns:w16du="http://schemas.microsoft.com/office/word/2023/wordml/word16du" xmlns:w16sdtdh="http://schemas.microsoft.com/office/word/2020/wordml/sdtdatahash" xmlns:w16sdtfl="http://schemas.microsoft.com/office/word/2024/wordml/sdtformatlock" xmlns:w16se="http://schemas.microsoft.com/office/word/2015/wordml/symex" xmlns:wpg="http://schemas.microsoft.com/office/word/2010/wordprocessingGroup" xmlns:wpi="http://schemas.microsoft.com/office/word/2010/wordprocessingInk" xmlns:wne="http://schemas.microsoft.com/office/word/2006/wordml" xmlns:wps="http://schemas.microsoft.com/office/word/2010/wordprocessingShape" mc:Ignorable="w14 w15 w16se w16cid w16 w16cex w16sdtdh w16sdtfl w16du wp14">
   <w:footnote w:type="separator" w:id="-1">
     <w:p>
       <w:r>
@@ -5412,17 +5679,7 @@
 </file>
 
 <file path=word/header1.xml><?xml version="1.0" encoding="utf-8"?>
-<w:hdr xmlns:wpc="http://schemas.microsoft.com/office/word/2010/wordprocessingCanvas" xmlns:cx="http://schemas.microsoft.com/office/drawing/2014/chartex" xmlns:cx1="http://schemas.microsoft.com/office/drawing/2015/9/8/chartex" xmlns:cx2="http://schemas.microsoft.com/office/drawing/2015/10/21/chartex" xmlns:cx3="http://schemas.microsoft.com/office/drawing/2016/5/9/chartex" xmlns:cx4="http://schemas.microsoft.com/office/drawing/2016/5/10/chartex" xmlns:cx5="http://schemas.microsoft.com/office/drawing/2016/5/11/chartex" xmlns:cx6="http://schemas.microsoft.com/office/drawing/2016/5/12/chartex" xmlns:cx7="http://schemas.microsoft.com/office/drawing/2016/5/13/chartex" xmlns:cx8="http://schemas.microsoft.com/office/drawing/2016/5/14/chartex" xmlns:mc="http://schemas.openxmlformats.org/markup-compatibility/2006" xmlns:aink="http://schemas.microsoft.com/office/drawing/2016/ink" xmlns:am3d="http://schemas.microsoft.com/office/drawing/2017/model3d" xmlns:o="urn:schemas-microsoft-com:office:office" xmlns:oel="http://schemas.microsoft.com/office/2019/extlst" xmlns:r="http://schemas.openxmlformats.org/officeDocument/2006/relationships" xmlns:m="http://schemas.openxmlformats.org/officeDocument/2006/math" xmlns:v="urn:schemas-microsoft-com:vml" xmlns:wp14="http://schemas.microsoft.com/office/word/2010/wordprocessingDrawing" xmlns:wp="http://schemas.openxmlformats.org/drawingml/2006/wordprocessingDrawing" xmlns:w10="urn:schemas-microsoft-com:office:word" xmlns:w="http://schemas.openxmlformats.org/wordprocessingml/2006/main" xmlns:w14="http://schemas.microsoft.com/office/word/2010/wordml" xmlns:w15="http://schemas.microsoft.com/office/word/2012/wordml" xmlns:w16cex="http://schemas.microsoft.com/office/word/2018/wordml/cex" xmlns:w16cid="http://schemas.microsoft.com/office/word/2016/wordml/cid" xmlns:w16="http://schemas.microsoft.com/office/word/2018/wordml" xmlns:w16du="http://schemas.microsoft.com/office/word/2023/wordml/word16du" xmlns:w16sdtdh="http://schemas.microsoft.com/office/word/2020/wordml/sdtdatahash" xmlns:w16se="http://schemas.microsoft.com/office/word/2015/wordml/symex" xmlns:wpg="http://schemas.microsoft.com/office/word/2010/wordprocessingGroup" xmlns:wpi="http://schemas.microsoft.com/office/word/2010/wordprocessingInk" xmlns:wne="http://schemas.microsoft.com/office/word/2006/wordml" xmlns:wps="http://schemas.microsoft.com/office/word/2010/wordprocessingShape" mc:Ignorable="w14 w15 w16se w16cid w16 w16cex w16sdtdh w16du wp14">
-  <w:p>
-    <w:pPr>
-      <w:pStyle w:val="Sidhuvud"/>
-    </w:pPr>
-  </w:p>
-</w:hdr>
-</file>
-
-<file path=word/header2.xml><?xml version="1.0" encoding="utf-8"?>
-<w:hdr xmlns:wpc="http://schemas.microsoft.com/office/word/2010/wordprocessingCanvas" xmlns:cx="http://schemas.microsoft.com/office/drawing/2014/chartex" xmlns:cx1="http://schemas.microsoft.com/office/drawing/2015/9/8/chartex" xmlns:cx2="http://schemas.microsoft.com/office/drawing/2015/10/21/chartex" xmlns:cx3="http://schemas.microsoft.com/office/drawing/2016/5/9/chartex" xmlns:cx4="http://schemas.microsoft.com/office/drawing/2016/5/10/chartex" xmlns:cx5="http://schemas.microsoft.com/office/drawing/2016/5/11/chartex" xmlns:cx6="http://schemas.microsoft.com/office/drawing/2016/5/12/chartex" xmlns:cx7="http://schemas.microsoft.com/office/drawing/2016/5/13/chartex" xmlns:cx8="http://schemas.microsoft.com/office/drawing/2016/5/14/chartex" xmlns:mc="http://schemas.openxmlformats.org/markup-compatibility/2006" xmlns:aink="http://schemas.microsoft.com/office/drawing/2016/ink" xmlns:am3d="http://schemas.microsoft.com/office/drawing/2017/model3d" xmlns:o="urn:schemas-microsoft-com:office:office" xmlns:oel="http://schemas.microsoft.com/office/2019/extlst" xmlns:r="http://schemas.openxmlformats.org/officeDocument/2006/relationships" xmlns:m="http://schemas.openxmlformats.org/officeDocument/2006/math" xmlns:v="urn:schemas-microsoft-com:vml" xmlns:wp14="http://schemas.microsoft.com/office/word/2010/wordprocessingDrawing" xmlns:wp="http://schemas.openxmlformats.org/drawingml/2006/wordprocessingDrawing" xmlns:w10="urn:schemas-microsoft-com:office:word" xmlns:w="http://schemas.openxmlformats.org/wordprocessingml/2006/main" xmlns:w14="http://schemas.microsoft.com/office/word/2010/wordml" xmlns:w15="http://schemas.microsoft.com/office/word/2012/wordml" xmlns:w16cex="http://schemas.microsoft.com/office/word/2018/wordml/cex" xmlns:w16cid="http://schemas.microsoft.com/office/word/2016/wordml/cid" xmlns:w16="http://schemas.microsoft.com/office/word/2018/wordml" xmlns:w16du="http://schemas.microsoft.com/office/word/2023/wordml/word16du" xmlns:w16sdtdh="http://schemas.microsoft.com/office/word/2020/wordml/sdtdatahash" xmlns:w16se="http://schemas.microsoft.com/office/word/2015/wordml/symex" xmlns:wpg="http://schemas.microsoft.com/office/word/2010/wordprocessingGroup" xmlns:wpi="http://schemas.microsoft.com/office/word/2010/wordprocessingInk" xmlns:wne="http://schemas.microsoft.com/office/word/2006/wordml" xmlns:wps="http://schemas.microsoft.com/office/word/2010/wordprocessingShape" mc:Ignorable="w14 w15 w16se w16cid w16 w16cex w16sdtdh w16du wp14">
+<w:hdr xmlns:wpc="http://schemas.microsoft.com/office/word/2010/wordprocessingCanvas" xmlns:cx="http://schemas.microsoft.com/office/drawing/2014/chartex" xmlns:cx1="http://schemas.microsoft.com/office/drawing/2015/9/8/chartex" xmlns:cx2="http://schemas.microsoft.com/office/drawing/2015/10/21/chartex" xmlns:cx3="http://schemas.microsoft.com/office/drawing/2016/5/9/chartex" xmlns:cx4="http://schemas.microsoft.com/office/drawing/2016/5/10/chartex" xmlns:cx5="http://schemas.microsoft.com/office/drawing/2016/5/11/chartex" xmlns:cx6="http://schemas.microsoft.com/office/drawing/2016/5/12/chartex" xmlns:cx7="http://schemas.microsoft.com/office/drawing/2016/5/13/chartex" xmlns:cx8="http://schemas.microsoft.com/office/drawing/2016/5/14/chartex" xmlns:mc="http://schemas.openxmlformats.org/markup-compatibility/2006" xmlns:aink="http://schemas.microsoft.com/office/drawing/2016/ink" xmlns:am3d="http://schemas.microsoft.com/office/drawing/2017/model3d" xmlns:o="urn:schemas-microsoft-com:office:office" xmlns:oel="http://schemas.microsoft.com/office/2019/extlst" xmlns:r="http://schemas.openxmlformats.org/officeDocument/2006/relationships" xmlns:m="http://schemas.openxmlformats.org/officeDocument/2006/math" xmlns:v="urn:schemas-microsoft-com:vml" xmlns:wp14="http://schemas.microsoft.com/office/word/2010/wordprocessingDrawing" xmlns:wp="http://schemas.openxmlformats.org/drawingml/2006/wordprocessingDrawing" xmlns:w10="urn:schemas-microsoft-com:office:word" xmlns:w="http://schemas.openxmlformats.org/wordprocessingml/2006/main" xmlns:w14="http://schemas.microsoft.com/office/word/2010/wordml" xmlns:w15="http://schemas.microsoft.com/office/word/2012/wordml" xmlns:w16cex="http://schemas.microsoft.com/office/word/2018/wordml/cex" xmlns:w16cid="http://schemas.microsoft.com/office/word/2016/wordml/cid" xmlns:w16="http://schemas.microsoft.com/office/word/2018/wordml" xmlns:w16du="http://schemas.microsoft.com/office/word/2023/wordml/word16du" xmlns:w16sdtdh="http://schemas.microsoft.com/office/word/2020/wordml/sdtdatahash" xmlns:w16sdtfl="http://schemas.microsoft.com/office/word/2024/wordml/sdtformatlock" xmlns:w16se="http://schemas.microsoft.com/office/word/2015/wordml/symex" xmlns:wpg="http://schemas.microsoft.com/office/word/2010/wordprocessingGroup" xmlns:wpi="http://schemas.microsoft.com/office/word/2010/wordprocessingInk" xmlns:wne="http://schemas.microsoft.com/office/word/2006/wordml" xmlns:wps="http://schemas.microsoft.com/office/word/2010/wordprocessingShape" mc:Ignorable="w14 w15 w16se w16cid w16 w16cex w16sdtdh w16sdtfl w16du wp14">
   <w:tbl>
     <w:tblPr>
       <w:tblStyle w:val="Tabellrutnt"/>
@@ -5538,7 +5795,7 @@
               <w:sz w:val="15"/>
               <w:szCs w:val="15"/>
             </w:rPr>
-            <w:t>4</w:t>
+            <w:t>6</w:t>
           </w:r>
           <w:r>
             <w:t xml:space="preserve"> </w:t>
@@ -5566,7 +5823,7 @@
               <w:sz w:val="15"/>
               <w:szCs w:val="15"/>
             </w:rPr>
-            <w:t>4</w:t>
+            <w:t>6</w:t>
           </w:r>
           <w:r>
             <w:rPr>
@@ -5590,7 +5847,7 @@
               <w:sz w:val="15"/>
               <w:szCs w:val="15"/>
             </w:rPr>
-            <w:t>5</w:t>
+            <w:t>6</w:t>
           </w:r>
           <w:r>
             <w:rPr>
@@ -5606,7 +5863,7 @@
               <w:sz w:val="15"/>
               <w:szCs w:val="15"/>
             </w:rPr>
-            <w:t>28</w:t>
+            <w:t>03</w:t>
           </w:r>
         </w:p>
       </w:tc>
@@ -5620,18 +5877,8 @@
 </w:hdr>
 </file>
 
-<file path=word/header3.xml><?xml version="1.0" encoding="utf-8"?>
-<w:hdr xmlns:wpc="http://schemas.microsoft.com/office/word/2010/wordprocessingCanvas" xmlns:cx="http://schemas.microsoft.com/office/drawing/2014/chartex" xmlns:cx1="http://schemas.microsoft.com/office/drawing/2015/9/8/chartex" xmlns:cx2="http://schemas.microsoft.com/office/drawing/2015/10/21/chartex" xmlns:cx3="http://schemas.microsoft.com/office/drawing/2016/5/9/chartex" xmlns:cx4="http://schemas.microsoft.com/office/drawing/2016/5/10/chartex" xmlns:cx5="http://schemas.microsoft.com/office/drawing/2016/5/11/chartex" xmlns:cx6="http://schemas.microsoft.com/office/drawing/2016/5/12/chartex" xmlns:cx7="http://schemas.microsoft.com/office/drawing/2016/5/13/chartex" xmlns:cx8="http://schemas.microsoft.com/office/drawing/2016/5/14/chartex" xmlns:mc="http://schemas.openxmlformats.org/markup-compatibility/2006" xmlns:aink="http://schemas.microsoft.com/office/drawing/2016/ink" xmlns:am3d="http://schemas.microsoft.com/office/drawing/2017/model3d" xmlns:o="urn:schemas-microsoft-com:office:office" xmlns:oel="http://schemas.microsoft.com/office/2019/extlst" xmlns:r="http://schemas.openxmlformats.org/officeDocument/2006/relationships" xmlns:m="http://schemas.openxmlformats.org/officeDocument/2006/math" xmlns:v="urn:schemas-microsoft-com:vml" xmlns:wp14="http://schemas.microsoft.com/office/word/2010/wordprocessingDrawing" xmlns:wp="http://schemas.openxmlformats.org/drawingml/2006/wordprocessingDrawing" xmlns:w10="urn:schemas-microsoft-com:office:word" xmlns:w="http://schemas.openxmlformats.org/wordprocessingml/2006/main" xmlns:w14="http://schemas.microsoft.com/office/word/2010/wordml" xmlns:w15="http://schemas.microsoft.com/office/word/2012/wordml" xmlns:w16cex="http://schemas.microsoft.com/office/word/2018/wordml/cex" xmlns:w16cid="http://schemas.microsoft.com/office/word/2016/wordml/cid" xmlns:w16="http://schemas.microsoft.com/office/word/2018/wordml" xmlns:w16du="http://schemas.microsoft.com/office/word/2023/wordml/word16du" xmlns:w16sdtdh="http://schemas.microsoft.com/office/word/2020/wordml/sdtdatahash" xmlns:w16se="http://schemas.microsoft.com/office/word/2015/wordml/symex" xmlns:wpg="http://schemas.microsoft.com/office/word/2010/wordprocessingGroup" xmlns:wpi="http://schemas.microsoft.com/office/word/2010/wordprocessingInk" xmlns:wne="http://schemas.microsoft.com/office/word/2006/wordml" xmlns:wps="http://schemas.microsoft.com/office/word/2010/wordprocessingShape" mc:Ignorable="w14 w15 w16se w16cid w16 w16cex w16sdtdh w16du wp14">
-  <w:p>
-    <w:pPr>
-      <w:pStyle w:val="Sidhuvud"/>
-    </w:pPr>
-  </w:p>
-</w:hdr>
-</file>
-
 <file path=word/numbering.xml><?xml version="1.0" encoding="utf-8"?>
-<w:numbering xmlns:wpc="http://schemas.microsoft.com/office/word/2010/wordprocessingCanvas" xmlns:cx="http://schemas.microsoft.com/office/drawing/2014/chartex" xmlns:cx1="http://schemas.microsoft.com/office/drawing/2015/9/8/chartex" xmlns:cx2="http://schemas.microsoft.com/office/drawing/2015/10/21/chartex" xmlns:cx3="http://schemas.microsoft.com/office/drawing/2016/5/9/chartex" xmlns:cx4="http://schemas.microsoft.com/office/drawing/2016/5/10/chartex" xmlns:cx5="http://schemas.microsoft.com/office/drawing/2016/5/11/chartex" xmlns:cx6="http://schemas.microsoft.com/office/drawing/2016/5/12/chartex" xmlns:cx7="http://schemas.microsoft.com/office/drawing/2016/5/13/chartex" xmlns:cx8="http://schemas.microsoft.com/office/drawing/2016/5/14/chartex" xmlns:mc="http://schemas.openxmlformats.org/markup-compatibility/2006" xmlns:aink="http://schemas.microsoft.com/office/drawing/2016/ink" xmlns:am3d="http://schemas.microsoft.com/office/drawing/2017/model3d" xmlns:o="urn:schemas-microsoft-com:office:office" xmlns:oel="http://schemas.microsoft.com/office/2019/extlst" xmlns:r="http://schemas.openxmlformats.org/officeDocument/2006/relationships" xmlns:m="http://schemas.openxmlformats.org/officeDocument/2006/math" xmlns:v="urn:schemas-microsoft-com:vml" xmlns:wp14="http://schemas.microsoft.com/office/word/2010/wordprocessingDrawing" xmlns:wp="http://schemas.openxmlformats.org/drawingml/2006/wordprocessingDrawing" xmlns:w10="urn:schemas-microsoft-com:office:word" xmlns:w="http://schemas.openxmlformats.org/wordprocessingml/2006/main" xmlns:w14="http://schemas.microsoft.com/office/word/2010/wordml" xmlns:w15="http://schemas.microsoft.com/office/word/2012/wordml" xmlns:w16cex="http://schemas.microsoft.com/office/word/2018/wordml/cex" xmlns:w16cid="http://schemas.microsoft.com/office/word/2016/wordml/cid" xmlns:w16="http://schemas.microsoft.com/office/word/2018/wordml" xmlns:w16du="http://schemas.microsoft.com/office/word/2023/wordml/word16du" xmlns:w16sdtdh="http://schemas.microsoft.com/office/word/2020/wordml/sdtdatahash" xmlns:w16se="http://schemas.microsoft.com/office/word/2015/wordml/symex" xmlns:wpg="http://schemas.microsoft.com/office/word/2010/wordprocessingGroup" xmlns:wpi="http://schemas.microsoft.com/office/word/2010/wordprocessingInk" xmlns:wne="http://schemas.microsoft.com/office/word/2006/wordml" xmlns:wps="http://schemas.microsoft.com/office/word/2010/wordprocessingShape" mc:Ignorable="w14 w15 w16se w16cid w16 w16cex w16sdtdh w16du wp14">
+<w:numbering xmlns:wpc="http://schemas.microsoft.com/office/word/2010/wordprocessingCanvas" xmlns:cx="http://schemas.microsoft.com/office/drawing/2014/chartex" xmlns:cx1="http://schemas.microsoft.com/office/drawing/2015/9/8/chartex" xmlns:cx2="http://schemas.microsoft.com/office/drawing/2015/10/21/chartex" xmlns:cx3="http://schemas.microsoft.com/office/drawing/2016/5/9/chartex" xmlns:cx4="http://schemas.microsoft.com/office/drawing/2016/5/10/chartex" xmlns:cx5="http://schemas.microsoft.com/office/drawing/2016/5/11/chartex" xmlns:cx6="http://schemas.microsoft.com/office/drawing/2016/5/12/chartex" xmlns:cx7="http://schemas.microsoft.com/office/drawing/2016/5/13/chartex" xmlns:cx8="http://schemas.microsoft.com/office/drawing/2016/5/14/chartex" xmlns:mc="http://schemas.openxmlformats.org/markup-compatibility/2006" xmlns:aink="http://schemas.microsoft.com/office/drawing/2016/ink" xmlns:am3d="http://schemas.microsoft.com/office/drawing/2017/model3d" xmlns:o="urn:schemas-microsoft-com:office:office" xmlns:oel="http://schemas.microsoft.com/office/2019/extlst" xmlns:r="http://schemas.openxmlformats.org/officeDocument/2006/relationships" xmlns:m="http://schemas.openxmlformats.org/officeDocument/2006/math" xmlns:v="urn:schemas-microsoft-com:vml" xmlns:wp14="http://schemas.microsoft.com/office/word/2010/wordprocessingDrawing" xmlns:wp="http://schemas.openxmlformats.org/drawingml/2006/wordprocessingDrawing" xmlns:w10="urn:schemas-microsoft-com:office:word" xmlns:w="http://schemas.openxmlformats.org/wordprocessingml/2006/main" xmlns:w14="http://schemas.microsoft.com/office/word/2010/wordml" xmlns:w15="http://schemas.microsoft.com/office/word/2012/wordml" xmlns:w16cex="http://schemas.microsoft.com/office/word/2018/wordml/cex" xmlns:w16cid="http://schemas.microsoft.com/office/word/2016/wordml/cid" xmlns:w16="http://schemas.microsoft.com/office/word/2018/wordml" xmlns:w16du="http://schemas.microsoft.com/office/word/2023/wordml/word16du" xmlns:w16sdtdh="http://schemas.microsoft.com/office/word/2020/wordml/sdtdatahash" xmlns:w16sdtfl="http://schemas.microsoft.com/office/word/2024/wordml/sdtformatlock" xmlns:w16se="http://schemas.microsoft.com/office/word/2015/wordml/symex" xmlns:wpg="http://schemas.microsoft.com/office/word/2010/wordprocessingGroup" xmlns:wpi="http://schemas.microsoft.com/office/word/2010/wordprocessingInk" xmlns:wne="http://schemas.microsoft.com/office/word/2006/wordml" xmlns:wps="http://schemas.microsoft.com/office/word/2010/wordprocessingShape" mc:Ignorable="w14 w15 w16se w16cid w16 w16cex w16sdtdh w16sdtfl w16du wp14">
   <w:numPicBullet w:numPicBulletId="0">
     <w:pict>
       <v:shapetype id="_x0000_t75" coordsize="21600,21600" o:spt="75" o:preferrelative="t" path="m@4@5l@4@11@9@11@9@5xe" filled="f" stroked="f">
@@ -5653,7 +5900,7 @@
         <v:path o:extrusionok="f" gradientshapeok="t" o:connecttype="rect"/>
         <o:lock v:ext="edit" aspectratio="t"/>
       </v:shapetype>
-      <v:shape id="_x0000_i1032" type="#_x0000_t75" style="width:3.5pt;height:9pt" o:bullet="t">
+      <v:shape id="_x0000_i1025" type="#_x0000_t75" style="width:3.75pt;height:9.15pt" o:bullet="t">
         <v:imagedata r:id="rId1" o:title="Pil-v2-Word"/>
       </v:shape>
     </w:pict>
@@ -7389,7 +7636,7 @@
 </file>
 
 <file path=word/styles.xml><?xml version="1.0" encoding="utf-8"?>
-<w:styles xmlns:mc="http://schemas.openxmlformats.org/markup-compatibility/2006" xmlns:r="http://schemas.openxmlformats.org/officeDocument/2006/relationships" xmlns:w="http://schemas.openxmlformats.org/wordprocessingml/2006/main" xmlns:w14="http://schemas.microsoft.com/office/word/2010/wordml" xmlns:w15="http://schemas.microsoft.com/office/word/2012/wordml" xmlns:w16cex="http://schemas.microsoft.com/office/word/2018/wordml/cex" xmlns:w16cid="http://schemas.microsoft.com/office/word/2016/wordml/cid" xmlns:w16="http://schemas.microsoft.com/office/word/2018/wordml" xmlns:w16du="http://schemas.microsoft.com/office/word/2023/wordml/word16du" xmlns:w16sdtdh="http://schemas.microsoft.com/office/word/2020/wordml/sdtdatahash" xmlns:w16se="http://schemas.microsoft.com/office/word/2015/wordml/symex" mc:Ignorable="w14 w15 w16se w16cid w16 w16cex w16sdtdh w16du">
+<w:styles xmlns:mc="http://schemas.openxmlformats.org/markup-compatibility/2006" xmlns:r="http://schemas.openxmlformats.org/officeDocument/2006/relationships" xmlns:w="http://schemas.openxmlformats.org/wordprocessingml/2006/main" xmlns:w14="http://schemas.microsoft.com/office/word/2010/wordml" xmlns:w15="http://schemas.microsoft.com/office/word/2012/wordml" xmlns:w16cex="http://schemas.microsoft.com/office/word/2018/wordml/cex" xmlns:w16cid="http://schemas.microsoft.com/office/word/2016/wordml/cid" xmlns:w16="http://schemas.microsoft.com/office/word/2018/wordml" xmlns:w16du="http://schemas.microsoft.com/office/word/2023/wordml/word16du" xmlns:w16sdtdh="http://schemas.microsoft.com/office/word/2020/wordml/sdtdatahash" xmlns:w16sdtfl="http://schemas.microsoft.com/office/word/2024/wordml/sdtformatlock" xmlns:w16se="http://schemas.microsoft.com/office/word/2015/wordml/symex" mc:Ignorable="w14 w15 w16se w16cid w16 w16cex w16sdtdh w16sdtfl w16du">
   <w:docDefaults>
     <w:rPrDefault>
       <w:rPr>
@@ -7767,7 +8014,7 @@
   <w:style w:type="paragraph" w:default="1" w:styleId="Normal">
     <w:name w:val="Normal"/>
     <w:qFormat/>
-    <w:rsid w:val="00732E7B"/>
+    <w:rsid w:val="002A4533"/>
   </w:style>
   <w:style w:type="paragraph" w:styleId="Rubrik1">
     <w:name w:val="heading 1"/>
@@ -9325,7 +9572,7 @@
 </file>
 
 <file path=word/glossary/document.xml><?xml version="1.0" encoding="utf-8"?>
-<w:glossaryDocument xmlns:wpc="http://schemas.microsoft.com/office/word/2010/wordprocessingCanvas" xmlns:cx="http://schemas.microsoft.com/office/drawing/2014/chartex" xmlns:cx1="http://schemas.microsoft.com/office/drawing/2015/9/8/chartex" xmlns:cx2="http://schemas.microsoft.com/office/drawing/2015/10/21/chartex" xmlns:cx3="http://schemas.microsoft.com/office/drawing/2016/5/9/chartex" xmlns:cx4="http://schemas.microsoft.com/office/drawing/2016/5/10/chartex" xmlns:cx5="http://schemas.microsoft.com/office/drawing/2016/5/11/chartex" xmlns:cx6="http://schemas.microsoft.com/office/drawing/2016/5/12/chartex" xmlns:cx7="http://schemas.microsoft.com/office/drawing/2016/5/13/chartex" xmlns:cx8="http://schemas.microsoft.com/office/drawing/2016/5/14/chartex" xmlns:mc="http://schemas.openxmlformats.org/markup-compatibility/2006" xmlns:aink="http://schemas.microsoft.com/office/drawing/2016/ink" xmlns:am3d="http://schemas.microsoft.com/office/drawing/2017/model3d" xmlns:o="urn:schemas-microsoft-com:office:office" xmlns:oel="http://schemas.microsoft.com/office/2019/extlst" xmlns:r="http://schemas.openxmlformats.org/officeDocument/2006/relationships" xmlns:m="http://schemas.openxmlformats.org/officeDocument/2006/math" xmlns:v="urn:schemas-microsoft-com:vml" xmlns:wp14="http://schemas.microsoft.com/office/word/2010/wordprocessingDrawing" xmlns:wp="http://schemas.openxmlformats.org/drawingml/2006/wordprocessingDrawing" xmlns:w10="urn:schemas-microsoft-com:office:word" xmlns:w="http://schemas.openxmlformats.org/wordprocessingml/2006/main" xmlns:w14="http://schemas.microsoft.com/office/word/2010/wordml" xmlns:w15="http://schemas.microsoft.com/office/word/2012/wordml" xmlns:w16cex="http://schemas.microsoft.com/office/word/2018/wordml/cex" xmlns:w16cid="http://schemas.microsoft.com/office/word/2016/wordml/cid" xmlns:w16="http://schemas.microsoft.com/office/word/2018/wordml" xmlns:w16du="http://schemas.microsoft.com/office/word/2023/wordml/word16du" xmlns:w16sdtdh="http://schemas.microsoft.com/office/word/2020/wordml/sdtdatahash" xmlns:w16se="http://schemas.microsoft.com/office/word/2015/wordml/symex" xmlns:wpg="http://schemas.microsoft.com/office/word/2010/wordprocessingGroup" xmlns:wpi="http://schemas.microsoft.com/office/word/2010/wordprocessingInk" xmlns:wne="http://schemas.microsoft.com/office/word/2006/wordml" xmlns:wps="http://schemas.microsoft.com/office/word/2010/wordprocessingShape" mc:Ignorable="w14 w15 w16se w16cid w16 w16cex w16sdtdh w16du wp14">
+<w:glossaryDocument xmlns:wpc="http://schemas.microsoft.com/office/word/2010/wordprocessingCanvas" xmlns:cx="http://schemas.microsoft.com/office/drawing/2014/chartex" xmlns:cx1="http://schemas.microsoft.com/office/drawing/2015/9/8/chartex" xmlns:cx2="http://schemas.microsoft.com/office/drawing/2015/10/21/chartex" xmlns:cx3="http://schemas.microsoft.com/office/drawing/2016/5/9/chartex" xmlns:cx4="http://schemas.microsoft.com/office/drawing/2016/5/10/chartex" xmlns:cx5="http://schemas.microsoft.com/office/drawing/2016/5/11/chartex" xmlns:cx6="http://schemas.microsoft.com/office/drawing/2016/5/12/chartex" xmlns:cx7="http://schemas.microsoft.com/office/drawing/2016/5/13/chartex" xmlns:cx8="http://schemas.microsoft.com/office/drawing/2016/5/14/chartex" xmlns:mc="http://schemas.openxmlformats.org/markup-compatibility/2006" xmlns:aink="http://schemas.microsoft.com/office/drawing/2016/ink" xmlns:am3d="http://schemas.microsoft.com/office/drawing/2017/model3d" xmlns:o="urn:schemas-microsoft-com:office:office" xmlns:oel="http://schemas.microsoft.com/office/2019/extlst" xmlns:r="http://schemas.openxmlformats.org/officeDocument/2006/relationships" xmlns:m="http://schemas.openxmlformats.org/officeDocument/2006/math" xmlns:v="urn:schemas-microsoft-com:vml" xmlns:wp14="http://schemas.microsoft.com/office/word/2010/wordprocessingDrawing" xmlns:wp="http://schemas.openxmlformats.org/drawingml/2006/wordprocessingDrawing" xmlns:w10="urn:schemas-microsoft-com:office:word" xmlns:w="http://schemas.openxmlformats.org/wordprocessingml/2006/main" xmlns:w14="http://schemas.microsoft.com/office/word/2010/wordml" xmlns:w15="http://schemas.microsoft.com/office/word/2012/wordml" xmlns:w16cex="http://schemas.microsoft.com/office/word/2018/wordml/cex" xmlns:w16cid="http://schemas.microsoft.com/office/word/2016/wordml/cid" xmlns:w16="http://schemas.microsoft.com/office/word/2018/wordml" xmlns:w16du="http://schemas.microsoft.com/office/word/2023/wordml/word16du" xmlns:w16sdtdh="http://schemas.microsoft.com/office/word/2020/wordml/sdtdatahash" xmlns:w16sdtfl="http://schemas.microsoft.com/office/word/2024/wordml/sdtformatlock" xmlns:w16se="http://schemas.microsoft.com/office/word/2015/wordml/symex" xmlns:wpg="http://schemas.microsoft.com/office/word/2010/wordprocessingGroup" xmlns:wpi="http://schemas.microsoft.com/office/word/2010/wordprocessingInk" xmlns:wne="http://schemas.microsoft.com/office/word/2006/wordml" xmlns:wps="http://schemas.microsoft.com/office/word/2010/wordprocessingShape" mc:Ignorable="w14 w15 w16se w16cid w16 w16cex w16sdtdh w16sdtfl w16du wp14">
   <w:docParts>
     <w:docPart>
       <w:docPartPr>
@@ -9390,7 +9637,7 @@
 </file>
 
 <file path=word/glossary/fontTable.xml><?xml version="1.0" encoding="utf-8"?>
-<w:fonts xmlns:mc="http://schemas.openxmlformats.org/markup-compatibility/2006" xmlns:r="http://schemas.openxmlformats.org/officeDocument/2006/relationships" xmlns:w="http://schemas.openxmlformats.org/wordprocessingml/2006/main" xmlns:w14="http://schemas.microsoft.com/office/word/2010/wordml" xmlns:w15="http://schemas.microsoft.com/office/word/2012/wordml" xmlns:w16cex="http://schemas.microsoft.com/office/word/2018/wordml/cex" xmlns:w16cid="http://schemas.microsoft.com/office/word/2016/wordml/cid" xmlns:w16="http://schemas.microsoft.com/office/word/2018/wordml" xmlns:w16du="http://schemas.microsoft.com/office/word/2023/wordml/word16du" xmlns:w16sdtdh="http://schemas.microsoft.com/office/word/2020/wordml/sdtdatahash" xmlns:w16se="http://schemas.microsoft.com/office/word/2015/wordml/symex" mc:Ignorable="w14 w15 w16se w16cid w16 w16cex w16sdtdh w16du">
+<w:fonts xmlns:mc="http://schemas.openxmlformats.org/markup-compatibility/2006" xmlns:r="http://schemas.openxmlformats.org/officeDocument/2006/relationships" xmlns:w="http://schemas.openxmlformats.org/wordprocessingml/2006/main" xmlns:w14="http://schemas.microsoft.com/office/word/2010/wordml" xmlns:w15="http://schemas.microsoft.com/office/word/2012/wordml" xmlns:w16cex="http://schemas.microsoft.com/office/word/2018/wordml/cex" xmlns:w16cid="http://schemas.microsoft.com/office/word/2016/wordml/cid" xmlns:w16="http://schemas.microsoft.com/office/word/2018/wordml" xmlns:w16du="http://schemas.microsoft.com/office/word/2023/wordml/word16du" xmlns:w16sdtdh="http://schemas.microsoft.com/office/word/2020/wordml/sdtdatahash" xmlns:w16sdtfl="http://schemas.microsoft.com/office/word/2024/wordml/sdtformatlock" xmlns:w16se="http://schemas.microsoft.com/office/word/2015/wordml/symex" mc:Ignorable="w14 w15 w16se w16cid w16 w16cex w16sdtdh w16sdtfl w16du">
   <w:font w:name="Symbol">
     <w:panose1 w:val="05050102010706020507"/>
     <w:charset w:val="02"/>
@@ -9410,7 +9657,7 @@
     <w:charset w:val="00"/>
     <w:family w:val="swiss"/>
     <w:pitch w:val="variable"/>
-    <w:sig w:usb0="E4002EFF" w:usb1="C000247B" w:usb2="00000009" w:usb3="00000000" w:csb0="000001FF" w:csb1="00000000"/>
+    <w:sig w:usb0="E4002EFF" w:usb1="C200247B" w:usb2="00000009" w:usb3="00000000" w:csb0="000001FF" w:csb1="00000000"/>
   </w:font>
   <w:font w:name="Courier New">
     <w:panose1 w:val="02070309020205020404"/>
@@ -9427,7 +9674,6 @@
     <w:sig w:usb0="00000000" w:usb1="10000000" w:usb2="00000000" w:usb3="00000000" w:csb0="80000000" w:csb1="00000000"/>
   </w:font>
   <w:font w:name="Open Sans">
-    <w:altName w:val="Segoe UI"/>
     <w:charset w:val="00"/>
     <w:family w:val="swiss"/>
     <w:pitch w:val="variable"/>
@@ -9442,7 +9688,6 @@
     <w:sig w:usb0="00000203" w:usb1="288F0000" w:usb2="00000016" w:usb3="00000000" w:csb0="00040001" w:csb1="00000000"/>
   </w:font>
   <w:font w:name="SimHei">
-    <w:altName w:val="黑体"/>
     <w:panose1 w:val="02010600030101010101"/>
     <w:charset w:val="86"/>
     <w:family w:val="modern"/>
@@ -9450,7 +9695,6 @@
     <w:sig w:usb0="800002BF" w:usb1="38CF7CFA" w:usb2="00000016" w:usb3="00000000" w:csb0="00040001" w:csb1="00000000"/>
   </w:font>
   <w:font w:name="Open Sans SemiBold">
-    <w:altName w:val="Segoe UI"/>
     <w:charset w:val="00"/>
     <w:family w:val="swiss"/>
     <w:pitch w:val="variable"/>
@@ -9479,7 +9723,7 @@
 </file>
 
 <file path=word/glossary/settings.xml><?xml version="1.0" encoding="utf-8"?>
-<w:settings xmlns:mc="http://schemas.openxmlformats.org/markup-compatibility/2006" xmlns:o="urn:schemas-microsoft-com:office:office" xmlns:r="http://schemas.openxmlformats.org/officeDocument/2006/relationships" xmlns:m="http://schemas.openxmlformats.org/officeDocument/2006/math" xmlns:v="urn:schemas-microsoft-com:vml" xmlns:w10="urn:schemas-microsoft-com:office:word" xmlns:w="http://schemas.openxmlformats.org/wordprocessingml/2006/main" xmlns:w14="http://schemas.microsoft.com/office/word/2010/wordml" xmlns:w15="http://schemas.microsoft.com/office/word/2012/wordml" xmlns:w16cex="http://schemas.microsoft.com/office/word/2018/wordml/cex" xmlns:w16cid="http://schemas.microsoft.com/office/word/2016/wordml/cid" xmlns:w16="http://schemas.microsoft.com/office/word/2018/wordml" xmlns:w16du="http://schemas.microsoft.com/office/word/2023/wordml/word16du" xmlns:w16sdtdh="http://schemas.microsoft.com/office/word/2020/wordml/sdtdatahash" xmlns:w16se="http://schemas.microsoft.com/office/word/2015/wordml/symex" xmlns:sl="http://schemas.openxmlformats.org/schemaLibrary/2006/main" mc:Ignorable="w14 w15 w16se w16cid w16 w16cex w16sdtdh w16du">
+<w:settings xmlns:mc="http://schemas.openxmlformats.org/markup-compatibility/2006" xmlns:o="urn:schemas-microsoft-com:office:office" xmlns:r="http://schemas.openxmlformats.org/officeDocument/2006/relationships" xmlns:m="http://schemas.openxmlformats.org/officeDocument/2006/math" xmlns:v="urn:schemas-microsoft-com:vml" xmlns:w10="urn:schemas-microsoft-com:office:word" xmlns:w="http://schemas.openxmlformats.org/wordprocessingml/2006/main" xmlns:w14="http://schemas.microsoft.com/office/word/2010/wordml" xmlns:w15="http://schemas.microsoft.com/office/word/2012/wordml" xmlns:w16cex="http://schemas.microsoft.com/office/word/2018/wordml/cex" xmlns:w16cid="http://schemas.microsoft.com/office/word/2016/wordml/cid" xmlns:w16="http://schemas.microsoft.com/office/word/2018/wordml" xmlns:w16du="http://schemas.microsoft.com/office/word/2023/wordml/word16du" xmlns:w16sdtdh="http://schemas.microsoft.com/office/word/2020/wordml/sdtdatahash" xmlns:w16sdtfl="http://schemas.microsoft.com/office/word/2024/wordml/sdtformatlock" xmlns:w16se="http://schemas.microsoft.com/office/word/2015/wordml/symex" xmlns:sl="http://schemas.openxmlformats.org/schemaLibrary/2006/main" mc:Ignorable="w14 w15 w16se w16cid w16 w16cex w16sdtdh w16sdtfl w16du">
   <w:view w:val="normal"/>
   <w:defaultTabStop w:val="720"/>
   <w:hyphenationZone w:val="425"/>
@@ -9496,10 +9740,12 @@
   <w:rsids>
     <w:rsidRoot w:val="00700452"/>
     <w:rsid w:val="003C7C2C"/>
+    <w:rsid w:val="003E09F8"/>
     <w:rsid w:val="004055F8"/>
     <w:rsid w:val="00700452"/>
     <w:rsid w:val="00760933"/>
     <w:rsid w:val="007F39BD"/>
+    <w:rsid w:val="00CA59DA"/>
     <w:rsid w:val="00DD0729"/>
   </w:rsids>
   <m:mathPr>
@@ -9524,7 +9770,7 @@
 </file>
 
 <file path=word/glossary/styles.xml><?xml version="1.0" encoding="utf-8"?>
-<w:styles xmlns:mc="http://schemas.openxmlformats.org/markup-compatibility/2006" xmlns:r="http://schemas.openxmlformats.org/officeDocument/2006/relationships" xmlns:w="http://schemas.openxmlformats.org/wordprocessingml/2006/main" xmlns:w14="http://schemas.microsoft.com/office/word/2010/wordml" xmlns:w15="http://schemas.microsoft.com/office/word/2012/wordml" xmlns:w16cex="http://schemas.microsoft.com/office/word/2018/wordml/cex" xmlns:w16cid="http://schemas.microsoft.com/office/word/2016/wordml/cid" xmlns:w16="http://schemas.microsoft.com/office/word/2018/wordml" xmlns:w16du="http://schemas.microsoft.com/office/word/2023/wordml/word16du" xmlns:w16sdtdh="http://schemas.microsoft.com/office/word/2020/wordml/sdtdatahash" xmlns:w16se="http://schemas.microsoft.com/office/word/2015/wordml/symex" mc:Ignorable="w14 w15 w16se w16cid w16 w16cex w16sdtdh w16du">
+<w:styles xmlns:mc="http://schemas.openxmlformats.org/markup-compatibility/2006" xmlns:r="http://schemas.openxmlformats.org/officeDocument/2006/relationships" xmlns:w="http://schemas.openxmlformats.org/wordprocessingml/2006/main" xmlns:w14="http://schemas.microsoft.com/office/word/2010/wordml" xmlns:w15="http://schemas.microsoft.com/office/word/2012/wordml" xmlns:w16cex="http://schemas.microsoft.com/office/word/2018/wordml/cex" xmlns:w16cid="http://schemas.microsoft.com/office/word/2016/wordml/cid" xmlns:w16="http://schemas.microsoft.com/office/word/2018/wordml" xmlns:w16du="http://schemas.microsoft.com/office/word/2023/wordml/word16du" xmlns:w16sdtdh="http://schemas.microsoft.com/office/word/2020/wordml/sdtdatahash" xmlns:w16sdtfl="http://schemas.microsoft.com/office/word/2024/wordml/sdtformatlock" xmlns:w16se="http://schemas.microsoft.com/office/word/2015/wordml/symex" mc:Ignorable="w14 w15 w16se w16cid w16 w16cex w16sdtdh w16sdtfl w16du">
   <w:docDefaults>
     <w:rPrDefault>
       <w:rPr>
@@ -9970,7 +10216,7 @@
 </file>
 
 <file path=word/glossary/webSettings.xml><?xml version="1.0" encoding="utf-8"?>
-<w:webSettings xmlns:mc="http://schemas.openxmlformats.org/markup-compatibility/2006" xmlns:r="http://schemas.openxmlformats.org/officeDocument/2006/relationships" xmlns:w="http://schemas.openxmlformats.org/wordprocessingml/2006/main" xmlns:w14="http://schemas.microsoft.com/office/word/2010/wordml" xmlns:w15="http://schemas.microsoft.com/office/word/2012/wordml" xmlns:w16cex="http://schemas.microsoft.com/office/word/2018/wordml/cex" xmlns:w16cid="http://schemas.microsoft.com/office/word/2016/wordml/cid" xmlns:w16="http://schemas.microsoft.com/office/word/2018/wordml" xmlns:w16du="http://schemas.microsoft.com/office/word/2023/wordml/word16du" xmlns:w16sdtdh="http://schemas.microsoft.com/office/word/2020/wordml/sdtdatahash" xmlns:w16se="http://schemas.microsoft.com/office/word/2015/wordml/symex" mc:Ignorable="w14 w15 w16se w16cid w16 w16cex w16sdtdh w16du">
+<w:webSettings xmlns:mc="http://schemas.openxmlformats.org/markup-compatibility/2006" xmlns:r="http://schemas.openxmlformats.org/officeDocument/2006/relationships" xmlns:w="http://schemas.openxmlformats.org/wordprocessingml/2006/main" xmlns:w14="http://schemas.microsoft.com/office/word/2010/wordml" xmlns:w15="http://schemas.microsoft.com/office/word/2012/wordml" xmlns:w16cex="http://schemas.microsoft.com/office/word/2018/wordml/cex" xmlns:w16cid="http://schemas.microsoft.com/office/word/2016/wordml/cid" xmlns:w16="http://schemas.microsoft.com/office/word/2018/wordml" xmlns:w16du="http://schemas.microsoft.com/office/word/2023/wordml/word16du" xmlns:w16sdtdh="http://schemas.microsoft.com/office/word/2020/wordml/sdtdatahash" xmlns:w16sdtfl="http://schemas.microsoft.com/office/word/2024/wordml/sdtformatlock" xmlns:w16se="http://schemas.microsoft.com/office/word/2015/wordml/symex" mc:Ignorable="w14 w15 w16se w16cid w16 w16cex w16sdtdh w16sdtfl w16du">
   <w:optimizeForBrowser/>
   <w:allowPNG/>
 </w:webSettings>
@@ -10333,17 +10579,6 @@
 </file>
 
 <file path=customXml/item1.xml><?xml version="1.0" encoding="utf-8"?>
-<p:properties xmlns:p="http://schemas.microsoft.com/office/2006/metadata/properties" xmlns:xsi="http://www.w3.org/2001/XMLSchema-instance" xmlns:pc="http://schemas.microsoft.com/office/infopath/2007/PartnerControls">
-  <documentManagement>
-    <TaxCatchAll xmlns="d7532cd0-e888-47d6-8f58-db0210f25002" xsi:nil="true"/>
-    <lcf76f155ced4ddcb4097134ff3c332f xmlns="10c3a147-0d64-46aa-a281-dc97358e8373">
-      <Terms xmlns="http://schemas.microsoft.com/office/infopath/2007/PartnerControls"/>
-    </lcf76f155ced4ddcb4097134ff3c332f>
-  </documentManagement>
-</p:properties>
-</file>
-
-<file path=customXml/item2.xml><?xml version="1.0" encoding="utf-8"?>
 <ct:contentTypeSchema xmlns:ct="http://schemas.microsoft.com/office/2006/metadata/contentType" xmlns:ma="http://schemas.microsoft.com/office/2006/metadata/properties/metaAttributes" ct:_="" ma:_="" ma:contentTypeName="dokument" ma:contentTypeID="0x010100129BBCBF21362E4099AE6C2F27C58737" ma:contentTypeVersion="23" ma:contentTypeDescription="Skapa ett nytt dokument." ma:contentTypeScope="" ma:versionID="a588d5298e31394954d678862d2d4064">
   <xsd:schema xmlns:xsd="http://www.w3.org/2001/XMLSchema" xmlns:xs="http://www.w3.org/2001/XMLSchema" xmlns:p="http://schemas.microsoft.com/office/2006/metadata/properties" xmlns:ns2="10c3a147-0d64-46aa-a281-dc97358e8373" xmlns:ns3="d7532cd0-e888-47d6-8f58-db0210f25002" targetNamespace="http://schemas.microsoft.com/office/2006/metadata/properties" ma:root="true" ma:fieldsID="4927f31759e8c18c444dc5df4d6c7e77" ns2:_="" ns3:_="">
     <xsd:import namespace="10c3a147-0d64-46aa-a281-dc97358e8373"/>
@@ -10580,11 +10815,18 @@
 </ct:contentTypeSchema>
 </file>
 
-<file path=customXml/item3.xml><?xml version="1.0" encoding="utf-8"?>
-<b:Sources xmlns:b="http://schemas.openxmlformats.org/officeDocument/2006/bibliography" xmlns="http://schemas.openxmlformats.org/officeDocument/2006/bibliography" SelectedStyle="\APASixthEditionOfficeOnline.xsl" StyleName="APA" Version="6"/>
+<file path=customXml/item2.xml><?xml version="1.0" encoding="utf-8"?>
+<p:properties xmlns:p="http://schemas.microsoft.com/office/2006/metadata/properties" xmlns:xsi="http://www.w3.org/2001/XMLSchema-instance" xmlns:pc="http://schemas.microsoft.com/office/infopath/2007/PartnerControls">
+  <documentManagement>
+    <TaxCatchAll xmlns="d7532cd0-e888-47d6-8f58-db0210f25002" xsi:nil="true"/>
+    <lcf76f155ced4ddcb4097134ff3c332f xmlns="10c3a147-0d64-46aa-a281-dc97358e8373">
+      <Terms xmlns="http://schemas.microsoft.com/office/infopath/2007/PartnerControls"/>
+    </lcf76f155ced4ddcb4097134ff3c332f>
+  </documentManagement>
+</p:properties>
 </file>
 
-<file path=customXml/item4.xml><?xml version="1.0" encoding="utf-8"?>
+<file path=customXml/item3.xml><?xml version="1.0" encoding="utf-8"?>
 <?mso-contentType ?>
 <FormTemplates xmlns="http://schemas.microsoft.com/sharepoint/v3/contenttype/forms">
   <Display>DocumentLibraryForm</Display>
@@ -10593,18 +10835,11 @@
 </FormTemplates>
 </file>
 
-<file path=customXml/itemProps1.xml><?xml version="1.0" encoding="utf-8"?>
-<ds:datastoreItem xmlns:ds="http://schemas.openxmlformats.org/officeDocument/2006/customXml" ds:itemID="{9DCCB28F-463D-45F3-8BD3-7ACCCA6F54F0}">
-  <ds:schemaRefs>
-    <ds:schemaRef ds:uri="http://schemas.microsoft.com/office/2006/metadata/properties"/>
-    <ds:schemaRef ds:uri="http://schemas.microsoft.com/office/infopath/2007/PartnerControls"/>
-    <ds:schemaRef ds:uri="d7532cd0-e888-47d6-8f58-db0210f25002"/>
-    <ds:schemaRef ds:uri="10c3a147-0d64-46aa-a281-dc97358e8373"/>
-  </ds:schemaRefs>
-</ds:datastoreItem>
+<file path=customXml/item4.xml><?xml version="1.0" encoding="utf-8"?>
+<b:Sources xmlns:b="http://schemas.openxmlformats.org/officeDocument/2006/bibliography" xmlns="http://schemas.openxmlformats.org/officeDocument/2006/bibliography" SelectedStyle="\APASixthEditionOfficeOnline.xsl" StyleName="APA" Version="6"/>
 </file>
 
-<file path=customXml/itemProps2.xml><?xml version="1.0" encoding="utf-8"?>
+<file path=customXml/itemProps1.xml><?xml version="1.0" encoding="utf-8"?>
 <ds:datastoreItem xmlns:ds="http://schemas.openxmlformats.org/officeDocument/2006/customXml" ds:itemID="{C5CBFB12-55FC-44A8-8F91-85C1937A0B43}">
   <ds:schemaRefs>
     <ds:schemaRef ds:uri="http://schemas.microsoft.com/office/2006/metadata/contentType"/>
@@ -10623,18 +10858,29 @@
 </ds:datastoreItem>
 </file>
 
+<file path=customXml/itemProps2.xml><?xml version="1.0" encoding="utf-8"?>
+<ds:datastoreItem xmlns:ds="http://schemas.openxmlformats.org/officeDocument/2006/customXml" ds:itemID="{9DCCB28F-463D-45F3-8BD3-7ACCCA6F54F0}">
+  <ds:schemaRefs>
+    <ds:schemaRef ds:uri="http://schemas.microsoft.com/office/2006/metadata/properties"/>
+    <ds:schemaRef ds:uri="http://schemas.microsoft.com/office/infopath/2007/PartnerControls"/>
+    <ds:schemaRef ds:uri="d7532cd0-e888-47d6-8f58-db0210f25002"/>
+    <ds:schemaRef ds:uri="10c3a147-0d64-46aa-a281-dc97358e8373"/>
+  </ds:schemaRefs>
+</ds:datastoreItem>
+</file>
+
 <file path=customXml/itemProps3.xml><?xml version="1.0" encoding="utf-8"?>
+<ds:datastoreItem xmlns:ds="http://schemas.openxmlformats.org/officeDocument/2006/customXml" ds:itemID="{57297251-69E8-4DA8-AF26-94224341CEF6}">
+  <ds:schemaRefs>
+    <ds:schemaRef ds:uri="http://schemas.microsoft.com/sharepoint/v3/contenttype/forms"/>
+  </ds:schemaRefs>
+</ds:datastoreItem>
+</file>
+
+<file path=customXml/itemProps4.xml><?xml version="1.0" encoding="utf-8"?>
 <ds:datastoreItem xmlns:ds="http://schemas.openxmlformats.org/officeDocument/2006/customXml" ds:itemID="{F425ED1F-C8BA-4C2F-B8CC-B65D72B8F6FA}">
   <ds:schemaRefs>
     <ds:schemaRef ds:uri="http://schemas.openxmlformats.org/officeDocument/2006/bibliography"/>
   </ds:schemaRefs>
 </ds:datastoreItem>
-</file>
-
-<file path=customXml/itemProps4.xml><?xml version="1.0" encoding="utf-8"?>
-<ds:datastoreItem xmlns:ds="http://schemas.openxmlformats.org/officeDocument/2006/customXml" ds:itemID="{57297251-69E8-4DA8-AF26-94224341CEF6}">
-  <ds:schemaRefs>
-    <ds:schemaRef ds:uri="http://schemas.microsoft.com/sharepoint/v3/contenttype/forms"/>
-  </ds:schemaRefs>
-</ds:datastoreItem>
 </file>
</xml_diff>